<commit_message>
fix: Homologacao 10/10 com 4 micro-ajustes aprovados pelos revisores (KKT bordo, bibtex, sinais Teorema 7B e polaridades)
</commit_message>
<xml_diff>
--- a/Publicacoes/RespostaAoProfessor_Analise11.docx
+++ b/Publicacoes/RespostaAoProfessor_Analise11.docx
@@ -3138,7 +3138,7 @@
           <w:i w:val="0"/>
           <w:sz w:val="22"/>
         </w:rPr>
-        <w:t>Como u(0) &gt; 0 e todos os coeficientes da matriz de transição exp(-t H_N) são não-negativos, as coordenadas u_i(t) decrescem estritamente e monotonicamente para zero:</w:t>
+        <w:t>Como H_N ≻ 0 é estritamente positiva definida com λ_{min}(H_N) = 1/4(N-2)(N-3) &gt; 0 para N ≥ 4, a solução analítica satisfaz lim_{t → ∈ fty} u(t) = 0. Ademais, pelo Teorema 7B, \|x(t)\|_2^2 é uma função estrita de Lyapunov em toda a região com cláusulas ativas, impedindo qualquer escape e garantindo que todas as trajetórias originadas em A_N colapsam no platô espúrio U_N:</w:t>
       </w:r>
     </w:p>
     <w:p>
@@ -3394,7 +3394,7 @@
           <w:i w:val="0"/>
           <w:sz w:val="22"/>
         </w:rPr>
-        <w:t>O gradiente de Φ_quad é dado por ∇ Φ_quad(x) = ∑_{c ∈ act(x)} g_c(x) σ^(c), onde act(x) = \{c \mid g_c(x) &gt; 0\}. Calculamos o produto interno com o vetor x:</w:t>
+        <w:t>O campo de gradiente descendente é dado por:</w:t>
       </w:r>
     </w:p>
     <w:p>
@@ -3409,7 +3409,7 @@
           <w:color w:val="143264"/>
           <w:sz w:val="22"/>
         </w:rPr>
-        <w:t>⟨ -∇ Φ_quad(x), x ⟩ = -∑_{c ∈ act(x)} g_c(x) ⟨ σ^(c), x ⟩ = -∑_{c ∈ act(x)} g_c(x) (∑_{j ∈ c} σ_j^(c) x_j)</w:t>
+        <w:t>-∇ Φ_quad(x) = -∑_{c ∈ act(x)} 2 g_c(x) ∇ g_c(x) = ∑_{c ∈ act(x)} g_c(x) σ^(c)</w:t>
       </w:r>
     </w:p>
     <w:p>
@@ -3422,7 +3422,7 @@
           <w:i w:val="0"/>
           <w:sz w:val="22"/>
         </w:rPr>
-        <w:t>Por definição da função de cláusula:</w:t>
+        <w:t>onde act(x) = \{c \mid g_c(x) &gt; 0\}. Calculamos o produto interno com o vetor de posição x:</w:t>
       </w:r>
     </w:p>
     <w:p>
@@ -3437,7 +3437,7 @@
           <w:color w:val="143264"/>
           <w:sz w:val="22"/>
         </w:rPr>
-        <w:t>g_c(x) = -1/2∑_{j ∈ c} σ_j^(c) x_j - 1/2 ⟹ ∑_{j ∈ c} σ_j^(c) x_j = -2 g_c(x) - 1</w:t>
+        <w:t>⟨ -∇ Φ_quad(x), x ⟩ = ∑_{c ∈ act(x)} g_c(x) ⟨ σ^(c), x ⟩ = ∑_{c ∈ act(x)} g_c(x) (∑_{j ∈ c} σ_j^(c) x_j)</w:t>
       </w:r>
     </w:p>
     <w:p>
@@ -3450,7 +3450,7 @@
           <w:i w:val="0"/>
           <w:sz w:val="22"/>
         </w:rPr>
-        <w:t>Substituindo esta identidade fundamental no produto interno:</w:t>
+        <w:t>Pela definição da função de cláusula:</w:t>
       </w:r>
     </w:p>
     <w:p>
@@ -3465,7 +3465,7 @@
           <w:color w:val="143264"/>
           <w:sz w:val="22"/>
         </w:rPr>
-        <w:t>⟨ -∇ Φ_quad(x), x ⟩ = -∑_{c ∈ act(x)} g_c(x) (-2 g_c(x) - 1) = ∑_{c ∈ act(x)} [2 g_c(x)^2 + g_c(x)]</w:t>
+        <w:t>g_c(x) = -1/2∑_{j ∈ c} σ_j^(c) x_j - 1/2 ⟹ ∑_{j ∈ c} σ_j^(c) x_j = -2 g_c(x) - 1</w:t>
       </w:r>
     </w:p>
     <w:p>
@@ -3478,7 +3478,7 @@
           <w:i w:val="0"/>
           <w:sz w:val="22"/>
         </w:rPr>
-        <w:t>Como x ∈ X \setminus U_N_barra possui ao menos uma cláusula ativa, temos g_c(x) &gt; 0 para c ∈ act(x). Portanto:</w:t>
+        <w:t>Substituindo esta identidade fundamental no produto interno:</w:t>
       </w:r>
     </w:p>
     <w:p>
@@ -3493,7 +3493,35 @@
           <w:color w:val="143264"/>
           <w:sz w:val="22"/>
         </w:rPr>
-        <w:t>2 g_c(x)^2 + g_c(x) &gt; 0 ⟹ ⟨ ∇ Φ_quad(x), x ⟩ &gt; 0 ⟹ ⟨ -∇ Φ_quad(x), x ⟩ &lt; 0</w:t>
+        <w:t>⟨ -∇ Φ_quad(x), x ⟩ = ∑_{c ∈ act(x)} g_c(x) (-2 g_c(x) - 1) = -∑_{c ∈ act(x)} [2 g_c(x)^2 + g_c(x)]</w:t>
+      </w:r>
+    </w:p>
+    <w:p>
+      <w:pPr>
+        <w:spacing w:after="80"/>
+      </w:pPr>
+      <w:r>
+        <w:rPr>
+          <w:rFonts w:ascii="Calibri" w:hAnsi="Calibri"/>
+          <w:i w:val="0"/>
+          <w:sz w:val="22"/>
+        </w:rPr>
+        <w:t>Como x ∈ X \setminus U_N_barra possui ao menos uma cláusula ativa, temos g_c(x) &gt; 0 para c ∈ act(x). Portanto:</w:t>
+      </w:r>
+    </w:p>
+    <w:p>
+      <w:pPr>
+        <w:spacing w:before="80" w:after="120"/>
+        <w:ind w:left="720"/>
+      </w:pPr>
+      <w:r>
+        <w:rPr>
+          <w:rFonts w:ascii="Calibri" w:hAnsi="Calibri"/>
+          <w:b/>
+          <w:color w:val="143264"/>
+          <w:sz w:val="22"/>
+        </w:rPr>
+        <w:t>2 g_c(x)^2 + g_c(x) &gt; 0 ⟹ ⟨ -∇ Φ_quad(x), x ⟩ &lt; -∑_{c ∈ act(x)} g_c(x) &lt; 0</w:t>
       </w:r>
     </w:p>
     <w:p>

</xml_diff>

<commit_message>
feat: CLG-R V4.0 convergence, analytical theorems 8-10, Irwin-Hall LP volume, Hirsch Horn separation, pre-registered protocol, and vectorized engine
</commit_message>
<xml_diff>
--- a/Publicacoes/RespostaAoProfessor_Analise11.docx
+++ b/Publicacoes/RespostaAoProfessor_Analise11.docx
@@ -1346,7 +1346,37 @@
           <w:b/>
           <w:sz w:val="22"/>
         </w:rPr>
-        <w:t>4.1. Teorema 4A (Propriedade Geométrica Fundamental)</w:t>
+        <w:t>4.1. Teorema 4A′ (Localização e Valor dos Mínimos Locais — Sem Hipótese H4)</w:t>
+      </w:r>
+    </w:p>
+    <w:p>
+      <w:pPr>
+        <w:spacing w:after="80"/>
+      </w:pPr>
+      <w:r>
+        <w:rPr>
+          <w:rFonts w:ascii="Calibri" w:hAnsi="Calibri"/>
+          <w:i w:val="0"/>
+          <w:sz w:val="22"/>
+        </w:rPr>
+        <w:t xml:space="preserve">A auditoria analítica comprovou que a antiga hipótese (H4) falha em aproximadamente 24% das arestas do hipercubo booleano em fórmulas típicas. O resultado foi generalizado para uma forma universal que </w:t>
+      </w:r>
+      <w:r>
+        <w:rPr>
+          <w:rFonts w:ascii="Calibri" w:hAnsi="Calibri"/>
+          <w:b/>
+          <w:i w:val="0"/>
+          <w:sz w:val="22"/>
+        </w:rPr>
+        <w:t>não requer (H4)</w:t>
+      </w:r>
+      <w:r>
+        <w:rPr>
+          <w:rFonts w:ascii="Calibri" w:hAnsi="Calibri"/>
+          <w:i w:val="0"/>
+          <w:sz w:val="22"/>
+        </w:rPr>
+        <w:t>:</w:t>
       </w:r>
     </w:p>
     <w:p>
@@ -1362,7 +1392,7 @@
           <w:color w:val="323232"/>
           <w:sz w:val="22"/>
         </w:rPr>
-        <w:t>Teorema 4A (Localização Estrita dos Mínimos Locais nos Vértices):</w:t>
+        <w:t>Teorema 4A′ (Localização e Valor dos Mínimos Locais no Hipercubo — Sem Hipótese H4):</w:t>
       </w:r>
     </w:p>
     <w:p>
@@ -1377,8 +1407,256 @@
           <w:color w:val="323232"/>
           <w:sz w:val="22"/>
         </w:rPr>
-        <w:t xml:space="preserve">Seja Φ_mult a extensão multilinear de uma fórmula 3-CNF satisfazendo as hipóteses de regularidade e a </w:t>
-      </w:r>
+        <w:t>Sob (H1), para qualquer fórmula 3-CNF, seja x^* um mínimo local da restrição de Φ_mult ao hipercubo compacto X = [-1, 1]^N, situado no interior relativo de uma face F de dimensão d ≥ 0. Então:</w:t>
+      </w:r>
+    </w:p>
+    <w:p>
+      <w:pPr>
+        <w:spacing w:before="60" w:after="60"/>
+        <w:ind w:left="576"/>
+      </w:pPr>
+      <w:r>
+        <w:rPr>
+          <w:rFonts w:ascii="Calibri" w:hAnsi="Calibri"/>
+          <w:i/>
+          <w:color w:val="323232"/>
+          <w:sz w:val="22"/>
+        </w:rPr>
+        <w:t>$Φ_mult(x^*) = E_{disc}(v), ∀ v ∈ \mathcal{V}(F)$</w:t>
+      </w:r>
+    </w:p>
+    <w:p>
+      <w:pPr>
+        <w:spacing w:before="60" w:after="60"/>
+        <w:ind w:left="576"/>
+      </w:pPr>
+      <w:r>
+        <w:rPr>
+          <w:rFonts w:ascii="Calibri" w:hAnsi="Calibri"/>
+          <w:i/>
+          <w:color w:val="323232"/>
+          <w:sz w:val="22"/>
+        </w:rPr>
+        <w:t>onde \mathcal{V}(F) denota o conjunto de vértices discretos do hipercubo pertencentes à face F.</w:t>
+      </w:r>
+    </w:p>
+    <w:p>
+      <w:pPr>
+        <w:spacing w:before="60" w:after="60"/>
+        <w:ind w:left="576"/>
+      </w:pPr>
+      <w:r>
+        <w:rPr>
+          <w:rFonts w:ascii="Calibri" w:hAnsi="Calibri"/>
+          <w:i/>
+          <w:color w:val="323232"/>
+          <w:sz w:val="22"/>
+        </w:rPr>
+        <w:t>Em particular, se x^</w:t>
+      </w:r>
+      <w:r>
+        <w:rPr>
+          <w:rFonts w:ascii="Calibri" w:hAnsi="Calibri"/>
+          <w:i/>
+          <w:color w:val="323232"/>
+          <w:sz w:val="22"/>
+        </w:rPr>
+        <w:t xml:space="preserve"> é um mínimo local estrito no hipercubo, então x^</w:t>
+      </w:r>
+      <w:r>
+        <w:rPr>
+          <w:rFonts w:ascii="Calibri" w:hAnsi="Calibri"/>
+          <w:i/>
+          <w:color w:val="323232"/>
+          <w:sz w:val="22"/>
+        </w:rPr>
+        <w:t xml:space="preserve"> é necessariamente um vértice discreto x^* ∈ \{-1, +1\}^N (face de dimensão d=0).</w:t>
+      </w:r>
+    </w:p>
+    <w:p>
+      <w:pPr>
+        <w:spacing w:after="80"/>
+      </w:pPr>
+      <w:r>
+        <w:rPr>
+          <w:rFonts w:ascii="Calibri" w:hAnsi="Calibri"/>
+          <w:b/>
+          <w:i w:val="0"/>
+          <w:sz w:val="22"/>
+        </w:rPr>
+        <w:t>Demonstração sem H4:</w:t>
+      </w:r>
+    </w:p>
+    <w:p>
+      <w:pPr>
+        <w:ind w:left="360"/>
+      </w:pPr>
+      <w:r>
+        <w:rPr>
+          <w:rFonts w:ascii="Calibri" w:hAnsi="Calibri"/>
+          <w:b/>
+          <w:sz w:val="22"/>
+        </w:rPr>
+        <w:t xml:space="preserve">1. </w:t>
+      </w:r>
+      <w:r>
+        <w:rPr>
+          <w:rFonts w:ascii="Calibri" w:hAnsi="Calibri"/>
+          <w:i w:val="0"/>
+          <w:sz w:val="22"/>
+        </w:rPr>
+        <w:t>Em qualquer face F de dimensão d ≥ 1, fixando as N-d coordenadas restritas em ± 1, a restrição Φ_{F} é multilinear e harmônica nas d variáveis livres: Δ_{F} Φ_{F} ≡ 0.</w:t>
+      </w:r>
+    </w:p>
+    <w:p>
+      <w:pPr>
+        <w:ind w:left="360"/>
+      </w:pPr>
+      <w:r>
+        <w:rPr>
+          <w:rFonts w:ascii="Calibri" w:hAnsi="Calibri"/>
+          <w:b/>
+          <w:sz w:val="22"/>
+        </w:rPr>
+        <w:t xml:space="preserve">2. </w:t>
+      </w:r>
+      <w:r>
+        <w:rPr>
+          <w:rFonts w:ascii="Calibri" w:hAnsi="Calibri"/>
+          <w:i w:val="0"/>
+          <w:sz w:val="22"/>
+        </w:rPr>
+        <w:t>Se x^</w:t>
+      </w:r>
+      <w:r>
+        <w:rPr>
+          <w:rFonts w:ascii="Calibri" w:hAnsi="Calibri"/>
+          <w:i/>
+          <w:sz w:val="22"/>
+        </w:rPr>
+        <w:t xml:space="preserve"> ∈ relint(F) é um mínimo local de Φ_mult|_{X}, então x^</w:t>
+      </w:r>
+      <w:r>
+        <w:rPr>
+          <w:rFonts w:ascii="Calibri" w:hAnsi="Calibri"/>
+          <w:i w:val="0"/>
+          <w:sz w:val="22"/>
+        </w:rPr>
+        <w:t xml:space="preserve"> é mínimo local de Φ_{F} no aberto conexo relint(F).</w:t>
+      </w:r>
+    </w:p>
+    <w:p>
+      <w:pPr>
+        <w:ind w:left="360"/>
+      </w:pPr>
+      <w:r>
+        <w:rPr>
+          <w:rFonts w:ascii="Calibri" w:hAnsi="Calibri"/>
+          <w:b/>
+          <w:sz w:val="22"/>
+        </w:rPr>
+        <w:t xml:space="preserve">3. </w:t>
+      </w:r>
+      <w:r>
+        <w:rPr>
+          <w:rFonts w:ascii="Calibri" w:hAnsi="Calibri"/>
+          <w:i w:val="0"/>
+          <w:sz w:val="22"/>
+        </w:rPr>
+        <w:t>Pelo Princípio do Mínimo Forte, Φ_{F} deve ser identicamente constante em uma vizinhança conexa de x^*. Sendo um polinômio multilinear, Φ_{F} é constante em toda a face compacta F:</w:t>
+      </w:r>
+    </w:p>
+    <w:p>
+      <w:pPr>
+        <w:spacing w:before="80" w:after="120"/>
+        <w:ind w:left="720"/>
+      </w:pPr>
+      <w:r>
+        <w:rPr>
+          <w:rFonts w:ascii="Calibri" w:hAnsi="Calibri"/>
+          <w:b/>
+          <w:color w:val="143264"/>
+          <w:sz w:val="22"/>
+        </w:rPr>
+        <w:t>Φ_mult(x) ≡ Φ_mult(x^*), ∀ x ∈ F</w:t>
+      </w:r>
+    </w:p>
+    <w:p>
+      <w:pPr>
+        <w:ind w:left="360"/>
+      </w:pPr>
+      <w:r>
+        <w:rPr>
+          <w:rFonts w:ascii="Calibri" w:hAnsi="Calibri"/>
+          <w:b/>
+          <w:sz w:val="22"/>
+        </w:rPr>
+        <w:t xml:space="preserve">4. </w:t>
+      </w:r>
+      <w:r>
+        <w:rPr>
+          <w:rFonts w:ascii="Calibri" w:hAnsi="Calibri"/>
+          <w:i w:val="0"/>
+          <w:sz w:val="22"/>
+        </w:rPr>
+        <w:t>Como nos vértices Φ_mult(v) = E_{disc}(v), o valor do mínimo local coincide exatamente com o valor de energia discreta de todos os vértices da face: Φ(x^*) = E_{disc}(v). Logo, arredondar coordenadas livres não altera a energia.</w:t>
+      </w:r>
+    </w:p>
+    <w:p>
+      <w:pPr>
+        <w:ind w:left="360"/>
+      </w:pPr>
+      <w:r>
+        <w:rPr>
+          <w:rFonts w:ascii="Calibri" w:hAnsi="Calibri"/>
+          <w:b/>
+          <w:sz w:val="22"/>
+        </w:rPr>
+        <w:t xml:space="preserve">5. </w:t>
+      </w:r>
+      <w:r>
+        <w:rPr>
+          <w:rFonts w:ascii="Calibri" w:hAnsi="Calibri"/>
+          <w:i w:val="0"/>
+          <w:sz w:val="22"/>
+        </w:rPr>
+        <w:t>Se x^</w:t>
+      </w:r>
+      <w:r>
+        <w:rPr>
+          <w:rFonts w:ascii="Calibri" w:hAnsi="Calibri"/>
+          <w:i/>
+          <w:sz w:val="22"/>
+        </w:rPr>
+        <w:t xml:space="preserve"> é mínimo local estrito, Φ não pode ser constante em uma vizinhança dimensional positiva, forçando d = 0, isto é, x^</w:t>
+      </w:r>
+      <w:r>
+        <w:rPr>
+          <w:rFonts w:ascii="Calibri" w:hAnsi="Calibri"/>
+          <w:i w:val="0"/>
+          <w:sz w:val="22"/>
+        </w:rPr>
+        <w:t xml:space="preserve"> ∈ \{-1, +1\}^N. ■</w:t>
+      </w:r>
+    </w:p>
+    <w:p>
+      <w:pPr>
+        <w:pStyle w:val="Heading4"/>
+      </w:pPr>
+      <w:r>
+        <w:rPr>
+          <w:rFonts w:ascii="Calibri" w:hAnsi="Calibri"/>
+          <w:b/>
+          <w:sz w:val="22"/>
+        </w:rPr>
+        <w:t>4.2. Corolário 4B (Confinamento dos Atratores Assintóticos do Fluxo Projetado — Sem H4)</w:t>
+      </w:r>
+    </w:p>
+    <w:p>
+      <w:pPr>
+        <w:spacing w:before="60" w:after="60"/>
+        <w:ind w:left="576"/>
+      </w:pPr>
       <w:r>
         <w:rPr>
           <w:rFonts w:ascii="Calibri" w:hAnsi="Calibri"/>
@@ -1387,8 +1665,14 @@
           <w:color w:val="323232"/>
           <w:sz w:val="22"/>
         </w:rPr>
-        <w:t>Hipótese de Não-Degenerescência de Fronteira (H4)</w:t>
-      </w:r>
+        <w:t>Corolário 4B (Confinamento dos Atratores Assintóticos sem Hipótese H4):</w:t>
+      </w:r>
+    </w:p>
+    <w:p>
+      <w:pPr>
+        <w:spacing w:before="60" w:after="60"/>
+        <w:ind w:left="576"/>
+      </w:pPr>
       <w:r>
         <w:rPr>
           <w:rFonts w:ascii="Calibri" w:hAnsi="Calibri"/>
@@ -1396,7 +1680,7 @@
           <w:color w:val="323232"/>
           <w:sz w:val="22"/>
         </w:rPr>
-        <w:t>: para todo i ∈ \{1, ..., N\} e toda configuração fixada s_{-i} ∈ \{-1, +1\}^{N-1}, a restrição afim unidimensional não é constante (b_i(s_{-i}) ≠ 0).</w:t>
+        <w:t>Considere o fluxo de gradiente projetado: \dot{x}(t) = \Pi_{T_{X}(x(t))}(-∇ Φ_mult(x(t))).</w:t>
       </w:r>
     </w:p>
     <w:p>
@@ -1411,8 +1695,812 @@
           <w:color w:val="323232"/>
           <w:sz w:val="22"/>
         </w:rPr>
-        <w:t xml:space="preserve">Então, </w:t>
-      </w:r>
+        <w:t>Sob (H1) e (H3'), todo ponto de equilíbrio isolado assintoticamente estável do fluxo projetado é estritamente um vértice discreto x^* ∈ \{-1, +1\}^N.</w:t>
+      </w:r>
+    </w:p>
+    <w:p>
+      <w:pPr>
+        <w:spacing w:after="80"/>
+      </w:pPr>
+      <w:r>
+        <w:rPr>
+          <w:rFonts w:ascii="Calibri" w:hAnsi="Calibri"/>
+          <w:b/>
+          <w:i w:val="0"/>
+          <w:sz w:val="22"/>
+        </w:rPr>
+        <w:t>Demonstração sem H4:</w:t>
+      </w:r>
+    </w:p>
+    <w:p>
+      <w:pPr>
+        <w:spacing w:after="80"/>
+      </w:pPr>
+      <w:r>
+        <w:rPr>
+          <w:rFonts w:ascii="Calibri" w:hAnsi="Calibri"/>
+          <w:i w:val="0"/>
+          <w:sz w:val="22"/>
+        </w:rPr>
+        <w:t>Pela função de Lyapunov V(x) = Φ_mult(x) com \dot{V} = -\|\Pi_{T_{X}(x)}(-∇ Φ)\|^2 ≤ 0, a estabilidade assintótica e o isolamento implicam que x^</w:t>
+      </w:r>
+      <w:r>
+        <w:rPr>
+          <w:rFonts w:ascii="Calibri" w:hAnsi="Calibri"/>
+          <w:i/>
+          <w:sz w:val="22"/>
+        </w:rPr>
+        <w:t xml:space="preserve"> é um mínimo local estrito de Φ_mult|_{X}. Pelo Teorema 4A′, nenhum ponto em face de dimensão d ≥ 1 pode ser mínimo local estrito. Logo, x^</w:t>
+      </w:r>
+      <w:r>
+        <w:rPr>
+          <w:rFonts w:ascii="Calibri" w:hAnsi="Calibri"/>
+          <w:i w:val="0"/>
+          <w:sz w:val="22"/>
+        </w:rPr>
+        <w:t xml:space="preserve"> reside exclusivamente em face de dimensão d=0: x^* ∈ \{-1, +1\}^N. ■</w:t>
+      </w:r>
+    </w:p>
+    <w:p>
+      <w:pPr>
+        <w:pStyle w:val="Heading2"/>
+      </w:pPr>
+      <w:r>
+        <w:rPr>
+          <w:rFonts w:ascii="Calibri" w:hAnsi="Calibri"/>
+          <w:b/>
+          <w:color w:val="1B488C"/>
+          <w:sz w:val="28"/>
+        </w:rPr>
+        <w:t>5. Teorema 5: Fatoração Matricial e Condicionamento Espectral da Hessiana Softplus</w:t>
+      </w:r>
+    </w:p>
+    <w:p>
+      <w:pPr>
+        <w:pStyle w:val="Heading3"/>
+      </w:pPr>
+      <w:r>
+        <w:rPr>
+          <w:rFonts w:ascii="Calibri" w:hAnsi="Calibri"/>
+          <w:b/>
+          <w:color w:val="282828"/>
+          <w:sz w:val="24"/>
+        </w:rPr>
+        <w:t>Acolhimento das Críticas (P149 a P183):</w:t>
+      </w:r>
+    </w:p>
+    <w:p>
+      <w:pPr>
+        <w:spacing w:after="80"/>
+      </w:pPr>
+      <w:r>
+        <w:rPr>
+          <w:rFonts w:ascii="Calibri" w:hAnsi="Calibri"/>
+          <w:i w:val="0"/>
+          <w:sz w:val="22"/>
+        </w:rPr>
+        <w:t>Vossa Senhoria aprovou a fatoração matricial ∇² Φ_soft(x) = V^T W(x) V e propôs uma extensão de grande valor: analisar as cotas espectrais e o número de condicionamento da Hessiana em relação à geometria espectral da matriz de incidência de restrições V.</w:t>
+      </w:r>
+    </w:p>
+    <w:p>
+      <w:pPr>
+        <w:pStyle w:val="Heading3"/>
+      </w:pPr>
+      <w:r>
+        <w:rPr>
+          <w:rFonts w:ascii="Calibri" w:hAnsi="Calibri"/>
+          <w:b/>
+          <w:color w:val="282828"/>
+          <w:sz w:val="24"/>
+        </w:rPr>
+        <w:t>Formulação Enriquecida (Versão 3.0):</w:t>
+      </w:r>
+    </w:p>
+    <w:p>
+      <w:pPr>
+        <w:spacing w:after="80"/>
+      </w:pPr>
+      <w:r>
+        <w:rPr>
+          <w:rFonts w:ascii="Calibri" w:hAnsi="Calibri"/>
+          <w:i w:val="0"/>
+          <w:sz w:val="22"/>
+        </w:rPr>
+        <w:t>Seja v_c = -1/2σ^(c) ∈ ℝ^N para cada cláusula c ∈ \{1, ..., M\}, formando as linhas da matriz de incidência V ∈ ℝ^{M × N}. A Hessiana Softplus decompõe-se exatamente como:</w:t>
+      </w:r>
+    </w:p>
+    <w:p>
+      <w:pPr>
+        <w:spacing w:before="80" w:after="120"/>
+        <w:ind w:left="720"/>
+      </w:pPr>
+      <w:r>
+        <w:rPr>
+          <w:rFonts w:ascii="Calibri" w:hAnsi="Calibri"/>
+          <w:b/>
+          <w:color w:val="143264"/>
+          <w:sz w:val="22"/>
+        </w:rPr>
+        <w:t>∇² Φ_soft(x) = V^T W(x) V</w:t>
+      </w:r>
+    </w:p>
+    <w:p>
+      <w:pPr>
+        <w:spacing w:after="80"/>
+      </w:pPr>
+      <w:r>
+        <w:rPr>
+          <w:rFonts w:ascii="Calibri" w:hAnsi="Calibri"/>
+          <w:i w:val="0"/>
+          <w:sz w:val="22"/>
+        </w:rPr>
+        <w:t>onde W(x) = diag(w_1(x), ..., w_M(x)) ≻ 0, com pesos escalares w_c(x) = β σ(β g_c(x))(1 - σ(β g_c(x))) &gt; 0.</w:t>
+      </w:r>
+    </w:p>
+    <w:p>
+      <w:pPr>
+        <w:spacing w:after="80"/>
+      </w:pPr>
+      <w:r>
+        <w:rPr>
+          <w:rFonts w:ascii="Calibri" w:hAnsi="Calibri"/>
+          <w:i w:val="0"/>
+          <w:sz w:val="22"/>
+        </w:rPr>
+        <w:t>Pelo Teorema do Minimax de Courant-Fischer e propriedades de produtos de formas quadráticas, quando rank(V) = N (posto coluna completo):</w:t>
+      </w:r>
+    </w:p>
+    <w:p>
+      <w:pPr>
+        <w:spacing w:before="80" w:after="120"/>
+        <w:ind w:left="720"/>
+      </w:pPr>
+      <w:r>
+        <w:rPr>
+          <w:rFonts w:ascii="Calibri" w:hAnsi="Calibri"/>
+          <w:b/>
+          <w:color w:val="143264"/>
+          <w:sz w:val="22"/>
+        </w:rPr>
+        <w:t>λ_{min}(∇² Φ_soft(x)) = min_{\|z\|_2=1} z^T V^T W(x) V z ≥ λ_{min}(W(x)) · λ_{min}(V^T V) &gt; 0</w:t>
+      </w:r>
+    </w:p>
+    <w:p>
+      <w:pPr>
+        <w:spacing w:before="80" w:after="120"/>
+        <w:ind w:left="720"/>
+      </w:pPr>
+      <w:r>
+        <w:rPr>
+          <w:rFonts w:ascii="Calibri" w:hAnsi="Calibri"/>
+          <w:b/>
+          <w:color w:val="143264"/>
+          <w:sz w:val="22"/>
+        </w:rPr>
+        <w:t>λ_{max}(∇² Φ_soft(x)) = max_{\|z\|_2=1} z^T V^T W(x) V z ≤ λ_{max}(W(x)) · λ_{max}(V^T V)</w:t>
+      </w:r>
+    </w:p>
+    <w:p>
+      <w:pPr>
+        <w:spacing w:after="80"/>
+      </w:pPr>
+      <w:r>
+        <w:rPr>
+          <w:rFonts w:ascii="Calibri" w:hAnsi="Calibri"/>
+          <w:i w:val="0"/>
+          <w:sz w:val="22"/>
+        </w:rPr>
+        <w:t>onde λ_{min}(W(x)) = min_{c=1,...,M} w_c(x) e λ_{max}(W(x)) = max_{c=1,...,M} w_c(x).</w:t>
+      </w:r>
+    </w:p>
+    <w:p>
+      <w:pPr>
+        <w:spacing w:after="80"/>
+      </w:pPr>
+      <w:r>
+        <w:rPr>
+          <w:rFonts w:ascii="Calibri" w:hAnsi="Calibri"/>
+          <w:b/>
+          <w:i w:val="0"/>
+          <w:sz w:val="22"/>
+        </w:rPr>
+        <w:t>Número de Condicionamento Espectral:</w:t>
+      </w:r>
+    </w:p>
+    <w:p>
+      <w:pPr>
+        <w:spacing w:after="80"/>
+      </w:pPr>
+      <w:r>
+        <w:rPr>
+          <w:rFonts w:ascii="Calibri" w:hAnsi="Calibri"/>
+          <w:i w:val="0"/>
+          <w:sz w:val="22"/>
+        </w:rPr>
+        <w:t>O número de condicionamento da Hessiana Softplus é estritamente delimitado por:</w:t>
+      </w:r>
+    </w:p>
+    <w:p>
+      <w:pPr>
+        <w:spacing w:before="80" w:after="120"/>
+        <w:ind w:left="720"/>
+      </w:pPr>
+      <w:r>
+        <w:rPr>
+          <w:rFonts w:ascii="Calibri" w:hAnsi="Calibri"/>
+          <w:b/>
+          <w:color w:val="143264"/>
+          <w:sz w:val="22"/>
+        </w:rPr>
+        <w:t>κ(∇² Φ_soft(x)) ≡ \frac{λ_{max}(∇² Φ_soft(x))}{λ_{min}(∇² Φ_soft(x))} ≤ \frac{λ_{max}(W(x))}{λ_{min}(W(x))} · \frac{λ_{max}(V^T V)}{λ_{min}(V^T V)} = κ(W(x)) · κ(V^T V)</w:t>
+      </w:r>
+    </w:p>
+    <w:p>
+      <w:pPr>
+        <w:spacing w:after="80"/>
+      </w:pPr>
+      <w:r>
+        <w:rPr>
+          <w:rFonts w:ascii="Calibri" w:hAnsi="Calibri"/>
+          <w:i w:val="0"/>
+          <w:sz w:val="22"/>
+        </w:rPr>
+        <w:t>Esta desigualdade conecta diretamente:</w:t>
+      </w:r>
+    </w:p>
+    <w:p>
+      <w:pPr>
+        <w:ind w:left="360"/>
+      </w:pPr>
+      <w:r>
+        <w:rPr>
+          <w:rFonts w:ascii="Calibri" w:hAnsi="Calibri"/>
+          <w:b/>
+          <w:sz w:val="22"/>
+        </w:rPr>
+        <w:t xml:space="preserve">1. </w:t>
+      </w:r>
+      <w:r>
+        <w:rPr>
+          <w:rFonts w:ascii="Calibri" w:hAnsi="Calibri"/>
+          <w:i w:val="0"/>
+          <w:sz w:val="22"/>
+        </w:rPr>
+        <w:t>A dispersão das saturações térmicas das cláusulas sob o parâmetro β (κ(W(x)));</w:t>
+      </w:r>
+    </w:p>
+    <w:p>
+      <w:pPr>
+        <w:ind w:left="360"/>
+      </w:pPr>
+      <w:r>
+        <w:rPr>
+          <w:rFonts w:ascii="Calibri" w:hAnsi="Calibri"/>
+          <w:b/>
+          <w:sz w:val="22"/>
+        </w:rPr>
+        <w:t xml:space="preserve">2. </w:t>
+      </w:r>
+      <w:r>
+        <w:rPr>
+          <w:rFonts w:ascii="Calibri" w:hAnsi="Calibri"/>
+          <w:i w:val="0"/>
+          <w:sz w:val="22"/>
+        </w:rPr>
+        <w:t>A geometria de conectividade e o alinhamento espectral da matriz de incidência do grafo de restrições (κ(V^T V)).</w:t>
+      </w:r>
+    </w:p>
+    <w:p>
+      <w:pPr>
+        <w:pStyle w:val="Heading2"/>
+      </w:pPr>
+      <w:r>
+        <w:rPr>
+          <w:rFonts w:ascii="Calibri" w:hAnsi="Calibri"/>
+          <w:b/>
+          <w:color w:val="1B488C"/>
+          <w:sz w:val="28"/>
+        </w:rPr>
+        <w:t>6. Teorema 6: Lipschitz do Gradiente e Regimes de Underflow IEEE 754</w:t>
+      </w:r>
+    </w:p>
+    <w:p>
+      <w:pPr>
+        <w:pStyle w:val="Heading3"/>
+      </w:pPr>
+      <w:r>
+        <w:rPr>
+          <w:rFonts w:ascii="Calibri" w:hAnsi="Calibri"/>
+          <w:b/>
+          <w:color w:val="282828"/>
+          <w:sz w:val="24"/>
+        </w:rPr>
+        <w:t>Acolhimento das Críticas (P185 a P224):</w:t>
+      </w:r>
+    </w:p>
+    <w:p>
+      <w:pPr>
+        <w:spacing w:after="80"/>
+      </w:pPr>
+      <w:r>
+        <w:rPr>
+          <w:rFonts w:ascii="Calibri" w:hAnsi="Calibri"/>
+          <w:i w:val="0"/>
+          <w:sz w:val="22"/>
+        </w:rPr>
+        <w:t>Acolhemos a recomendação terminológica de Vossa Senhoria:</w:t>
+      </w:r>
+    </w:p>
+    <w:p>
+      <w:pPr>
+        <w:ind w:left="360"/>
+      </w:pPr>
+      <w:r>
+        <w:rPr>
+          <w:rFonts w:ascii="Calibri" w:hAnsi="Calibri"/>
+          <w:b/>
+          <w:sz w:val="22"/>
+        </w:rPr>
+        <w:t xml:space="preserve">•  </w:t>
+      </w:r>
+      <w:r>
+        <w:rPr>
+          <w:rFonts w:ascii="Calibri" w:hAnsi="Calibri"/>
+          <w:i w:val="0"/>
+          <w:sz w:val="22"/>
+        </w:rPr>
+        <w:t xml:space="preserve">L_β passa a ser qualificado explicitamente como </w:t>
+      </w:r>
+      <w:r>
+        <w:rPr>
+          <w:rFonts w:ascii="Calibri" w:hAnsi="Calibri"/>
+          <w:b/>
+          <w:i w:val="0"/>
+          <w:sz w:val="22"/>
+        </w:rPr>
+        <w:t>"constante de Lipschitz do campo gradiente"</w:t>
+      </w:r>
+      <w:r>
+        <w:rPr>
+          <w:rFonts w:ascii="Calibri" w:hAnsi="Calibri"/>
+          <w:i w:val="0"/>
+          <w:sz w:val="22"/>
+        </w:rPr>
+        <w:t>:</w:t>
+      </w:r>
+    </w:p>
+    <w:p>
+      <w:pPr>
+        <w:spacing w:before="80" w:after="120"/>
+        <w:ind w:left="720"/>
+      </w:pPr>
+      <w:r>
+        <w:rPr>
+          <w:rFonts w:ascii="Calibri" w:hAnsi="Calibri"/>
+          <w:b/>
+          <w:color w:val="143264"/>
+          <w:sz w:val="22"/>
+        </w:rPr>
+        <w:t>\|∇ Φ_soft(x) - ∇ Φ_soft(y)\|_2 ≤ L_β \|x - y\|_2</w:t>
+      </w:r>
+    </w:p>
+    <w:p>
+      <w:pPr>
+        <w:ind w:left="360"/>
+      </w:pPr>
+      <w:r>
+        <w:rPr>
+          <w:rFonts w:ascii="Calibri" w:hAnsi="Calibri"/>
+          <w:b/>
+          <w:sz w:val="22"/>
+        </w:rPr>
+        <w:t xml:space="preserve">•  </w:t>
+      </w:r>
+      <w:r>
+        <w:rPr>
+          <w:rFonts w:ascii="Calibri" w:hAnsi="Calibri"/>
+          <w:i w:val="0"/>
+          <w:sz w:val="22"/>
+        </w:rPr>
+        <w:t>A cota sanduíche permanece perfeitamente consolidada:</w:t>
+      </w:r>
+    </w:p>
+    <w:p>
+      <w:pPr>
+        <w:spacing w:before="80" w:after="120"/>
+        <w:ind w:left="720"/>
+      </w:pPr>
+      <w:r>
+        <w:rPr>
+          <w:rFonts w:ascii="Calibri" w:hAnsi="Calibri"/>
+          <w:b/>
+          <w:color w:val="143264"/>
+          <w:sz w:val="22"/>
+        </w:rPr>
+        <w:t>3/16β ≤ L_β ≤ \frac{3 d_{max}}{16}β ⟹ L_β = Θ(β)</w:t>
+      </w:r>
+    </w:p>
+    <w:p>
+      <w:pPr>
+        <w:ind w:left="360"/>
+      </w:pPr>
+      <w:r>
+        <w:rPr>
+          <w:rFonts w:ascii="Calibri" w:hAnsi="Calibri"/>
+          <w:b/>
+          <w:sz w:val="22"/>
+        </w:rPr>
+        <w:t xml:space="preserve">•  </w:t>
+      </w:r>
+      <w:r>
+        <w:rPr>
+          <w:rFonts w:ascii="Calibri" w:hAnsi="Calibri"/>
+          <w:i w:val="0"/>
+          <w:sz w:val="22"/>
+        </w:rPr>
+        <w:t>A caracterização de underflow exponencial uniforme na subcaixa central contraída U_N(ρ) = (-ρ, ρ)^N (ρ &lt; 1/3) foi preservada com rigor nas normas L_ ∈ fty e L_2:</w:t>
+      </w:r>
+    </w:p>
+    <w:p>
+      <w:pPr>
+        <w:spacing w:before="80" w:after="120"/>
+        <w:ind w:left="720"/>
+      </w:pPr>
+      <w:r>
+        <w:rPr>
+          <w:rFonts w:ascii="Calibri" w:hAnsi="Calibri"/>
+          <w:b/>
+          <w:color w:val="143264"/>
+          <w:sz w:val="22"/>
+        </w:rPr>
+        <w:t>\|∇ Φ_soft(x)\|_ ∈ fty ≤ M/2 e^{-(β/2)(1 - 3ρ)}, \|∇ Φ_soft(x)\|_2 ≤ (√(3) M/2) e^{-(β/2)(1 - 3ρ)}</w:t>
+      </w:r>
+    </w:p>
+    <w:p>
+      <w:pPr>
+        <w:ind w:left="360"/>
+      </w:pPr>
+      <w:r>
+        <w:rPr>
+          <w:rFonts w:ascii="Calibri" w:hAnsi="Calibri"/>
+          <w:b/>
+          <w:sz w:val="22"/>
+        </w:rPr>
+        <w:t xml:space="preserve">•  </w:t>
+      </w:r>
+      <w:r>
+        <w:rPr>
+          <w:rFonts w:ascii="Calibri" w:hAnsi="Calibri"/>
+          <w:i w:val="0"/>
+          <w:sz w:val="22"/>
+        </w:rPr>
+        <w:t>A separação entre os limiares IEEE 754 para underflow normal e subnormal (flush-to-zero) foi mantida intacta (β ≈ 175 vs 207 em FP32; β ≈ 1417 vs 1489 em FP64).</w:t>
+      </w:r>
+    </w:p>
+    <w:p>
+      <w:pPr>
+        <w:pStyle w:val="Heading2"/>
+      </w:pPr>
+      <w:r>
+        <w:rPr>
+          <w:rFonts w:ascii="Calibri" w:hAnsi="Calibri"/>
+          <w:b/>
+          <w:color w:val="1B488C"/>
+          <w:sz w:val="28"/>
+        </w:rPr>
+        <w:t>7. O Ponto Crucial do Parecer 11: Resolução da Proposição 7</w:t>
+      </w:r>
+    </w:p>
+    <w:p>
+      <w:pPr>
+        <w:pStyle w:val="Heading3"/>
+      </w:pPr>
+      <w:r>
+        <w:rPr>
+          <w:rFonts w:ascii="Calibri" w:hAnsi="Calibri"/>
+          <w:b/>
+          <w:color w:val="282828"/>
+          <w:sz w:val="24"/>
+        </w:rPr>
+        <w:t>Acolhimento da Recusa Justa (P226 a P284):</w:t>
+      </w:r>
+    </w:p>
+    <w:p>
+      <w:pPr>
+        <w:spacing w:after="80"/>
+      </w:pPr>
+      <w:r>
+        <w:rPr>
+          <w:rFonts w:ascii="Calibri" w:hAnsi="Calibri"/>
+          <w:i w:val="0"/>
+          <w:sz w:val="22"/>
+        </w:rPr>
+        <w:t>Concordamos plenamente e sem reservas com o diagnóstico de Vossa Senhoria:</w:t>
+      </w:r>
+    </w:p>
+    <w:p>
+      <w:pPr>
+        <w:ind w:left="360"/>
+      </w:pPr>
+      <w:r>
+        <w:rPr>
+          <w:rFonts w:ascii="Calibri" w:hAnsi="Calibri"/>
+          <w:b/>
+          <w:sz w:val="22"/>
+        </w:rPr>
+        <w:t xml:space="preserve">1. </w:t>
+      </w:r>
+      <w:r>
+        <w:rPr>
+          <w:rFonts w:ascii="Calibri" w:hAnsi="Calibri"/>
+          <w:i w:val="0"/>
+          <w:sz w:val="22"/>
+        </w:rPr>
+        <w:t>No limite assintótico N → ∈ fty, o volume da caixa central Vol(U_N) = (2/3)^N → 0 (e a medida normalizada (1/3)^N → 0).</w:t>
+      </w:r>
+    </w:p>
+    <w:p>
+      <w:pPr>
+        <w:ind w:left="360"/>
+      </w:pPr>
+      <w:r>
+        <w:rPr>
+          <w:rFonts w:ascii="Calibri" w:hAnsi="Calibri"/>
+          <w:b/>
+          <w:sz w:val="22"/>
+        </w:rPr>
+        <w:t xml:space="preserve">2. </w:t>
+      </w:r>
+      <w:r>
+        <w:rPr>
+          <w:rFonts w:ascii="Calibri" w:hAnsi="Calibri"/>
+          <w:i w:val="0"/>
+          <w:sz w:val="22"/>
+        </w:rPr>
+        <w:t xml:space="preserve">A existência de uma subcaixa de gradiente nulo de volume (2/3)^N, por si só, </w:t>
+      </w:r>
+      <w:r>
+        <w:rPr>
+          <w:rFonts w:ascii="Calibri" w:hAnsi="Calibri"/>
+          <w:b/>
+          <w:i w:val="0"/>
+          <w:sz w:val="22"/>
+        </w:rPr>
+        <w:t>não demonstra</w:t>
+      </w:r>
+      <w:r>
+        <w:rPr>
+          <w:rFonts w:ascii="Calibri" w:hAnsi="Calibri"/>
+          <w:i w:val="0"/>
+          <w:sz w:val="22"/>
+        </w:rPr>
+        <w:t xml:space="preserve"> que quase toda trajetória iniciada aleatoriamente no hipercubo convergirá para ela (M_spur ≥ 1 - o(1)).</w:t>
+      </w:r>
+    </w:p>
+    <w:p>
+      <w:pPr>
+        <w:ind w:left="360"/>
+      </w:pPr>
+      <w:r>
+        <w:rPr>
+          <w:rFonts w:ascii="Calibri" w:hAnsi="Calibri"/>
+          <w:b/>
+          <w:sz w:val="22"/>
+        </w:rPr>
+        <w:t xml:space="preserve">3. </w:t>
+      </w:r>
+      <w:r>
+        <w:rPr>
+          <w:rFonts w:ascii="Calibri" w:hAnsi="Calibri"/>
+          <w:i w:val="0"/>
+          <w:sz w:val="22"/>
+        </w:rPr>
+        <w:t>O campo médio 𝔼[-∇ Φ] ≈ -κ x em ensembles aleatórios descreve o valor esperado do vetor tangente em um ponto, mas não prova matematicamente a concentração das realizações das trajetórias individuais sem uma análise formal de flutuações e dinâmica estocástica.</w:t>
+      </w:r>
+    </w:p>
+    <w:p>
+      <w:pPr>
+        <w:ind w:left="360"/>
+      </w:pPr>
+      <w:r>
+        <w:rPr>
+          <w:rFonts w:ascii="Calibri" w:hAnsi="Calibri"/>
+          <w:b/>
+          <w:sz w:val="22"/>
+        </w:rPr>
+        <w:t xml:space="preserve">4. </w:t>
+      </w:r>
+      <w:r>
+        <w:rPr>
+          <w:rFonts w:ascii="Calibri" w:hAnsi="Calibri"/>
+          <w:i w:val="0"/>
+          <w:sz w:val="22"/>
+        </w:rPr>
+        <w:t>Harmonicidade (Δ Φ_mult = 0) veda mínimos locais interiores, mas não fornece por si só uma cota quantitativa imediata de M_spur(Φ_mult) = 0.</w:t>
+      </w:r>
+    </w:p>
+    <w:p>
+      <w:pPr>
+        <w:spacing w:after="80"/>
+      </w:pPr>
+      <w:r>
+        <w:rPr>
+          <w:rFonts w:ascii="Calibri" w:hAnsi="Calibri"/>
+          <w:i w:val="0"/>
+          <w:sz w:val="22"/>
+        </w:rPr>
+        <w:t xml:space="preserve">Portanto, </w:t>
+      </w:r>
+      <w:r>
+        <w:rPr>
+          <w:rFonts w:ascii="Calibri" w:hAnsi="Calibri"/>
+          <w:b/>
+          <w:i w:val="0"/>
+          <w:sz w:val="22"/>
+        </w:rPr>
+        <w:t>a reclassificação foi executada com absoluto rigor</w:t>
+      </w:r>
+      <w:r>
+        <w:rPr>
+          <w:rFonts w:ascii="Calibri" w:hAnsi="Calibri"/>
+          <w:i w:val="0"/>
+          <w:sz w:val="22"/>
+        </w:rPr>
+        <w:t>. Seguindo as orientações de Vossa Senhoria (P301 a P355), reorganizamos o programa da seguinte forma:</w:t>
+      </w:r>
+    </w:p>
+    <w:p>
+      <w:pPr>
+        <w:ind w:left="360"/>
+      </w:pPr>
+      <w:r>
+        <w:rPr>
+          <w:rFonts w:ascii="Calibri" w:hAnsi="Calibri"/>
+          <w:b/>
+          <w:sz w:val="22"/>
+        </w:rPr>
+        <w:t xml:space="preserve">•  </w:t>
+      </w:r>
+      <w:r>
+        <w:rPr>
+          <w:rFonts w:ascii="Calibri" w:hAnsi="Calibri"/>
+          <w:b/>
+          <w:i w:val="0"/>
+          <w:sz w:val="22"/>
+        </w:rPr>
+        <w:t>Teoremas Estruturais Provados (1 a 6):</w:t>
+      </w:r>
+      <w:r>
+        <w:rPr>
+          <w:rFonts w:ascii="Calibri" w:hAnsi="Calibri"/>
+          <w:i w:val="0"/>
+          <w:sz w:val="22"/>
+        </w:rPr>
+        <w:t xml:space="preserve"> Geometria estática, ausência de mínimos interiores, localização de vértices, fatoração matricial e controle de Lipschitz.</w:t>
+      </w:r>
+    </w:p>
+    <w:p>
+      <w:pPr>
+        <w:ind w:left="360"/>
+      </w:pPr>
+      <w:r>
+        <w:rPr>
+          <w:rFonts w:ascii="Calibri" w:hAnsi="Calibri"/>
+          <w:b/>
+          <w:sz w:val="22"/>
+        </w:rPr>
+        <w:t xml:space="preserve">•  </w:t>
+      </w:r>
+      <w:r>
+        <w:rPr>
+          <w:rFonts w:ascii="Calibri" w:hAnsi="Calibri"/>
+          <w:b/>
+          <w:i w:val="0"/>
+          <w:sz w:val="22"/>
+        </w:rPr>
+        <w:t>Teorema 7A (Construtivo):</w:t>
+      </w:r>
+      <w:r>
+        <w:rPr>
+          <w:rFonts w:ascii="Calibri" w:hAnsi="Calibri"/>
+          <w:i w:val="0"/>
+          <w:sz w:val="22"/>
+        </w:rPr>
+        <w:t xml:space="preserve"> Prova analítica de atração de bacia de volume estritamente não-nulo para uma família explícita com simetria.</w:t>
+      </w:r>
+    </w:p>
+    <w:p>
+      <w:pPr>
+        <w:ind w:left="360"/>
+      </w:pPr>
+      <w:r>
+        <w:rPr>
+          <w:rFonts w:ascii="Calibri" w:hAnsi="Calibri"/>
+          <w:b/>
+          <w:sz w:val="22"/>
+        </w:rPr>
+        <w:t xml:space="preserve">•  </w:t>
+      </w:r>
+      <w:r>
+        <w:rPr>
+          <w:rFonts w:ascii="Calibri" w:hAnsi="Calibri"/>
+          <w:b/>
+          <w:i w:val="0"/>
+          <w:sz w:val="22"/>
+        </w:rPr>
+        <w:t>Teorema 7B (Contração Centrípeta Universal do Hinge):</w:t>
+      </w:r>
+      <w:r>
+        <w:rPr>
+          <w:rFonts w:ascii="Calibri" w:hAnsi="Calibri"/>
+          <w:i w:val="0"/>
+          <w:sz w:val="22"/>
+        </w:rPr>
+        <w:t xml:space="preserve"> Prova universal de que \|x(t)\|_2^2 é uma função estrita de Lyapunov para Φ_quad, garantindo M_spur(Φ_quad) ≡ 1 para toda fórmula UNSAT.</w:t>
+      </w:r>
+    </w:p>
+    <w:p>
+      <w:pPr>
+        <w:ind w:left="360"/>
+      </w:pPr>
+      <w:r>
+        <w:rPr>
+          <w:rFonts w:ascii="Calibri" w:hAnsi="Calibri"/>
+          <w:b/>
+          <w:sz w:val="22"/>
+        </w:rPr>
+        <w:t xml:space="preserve">•  </w:t>
+      </w:r>
+      <w:r>
+        <w:rPr>
+          <w:rFonts w:ascii="Calibri" w:hAnsi="Calibri"/>
+          <w:b/>
+          <w:i w:val="0"/>
+          <w:sz w:val="22"/>
+        </w:rPr>
+        <w:t>Conjectura Central do Programa CLG-R:</w:t>
+      </w:r>
+      <w:r>
+        <w:rPr>
+          <w:rFonts w:ascii="Calibri" w:hAnsi="Calibri"/>
+          <w:i w:val="0"/>
+          <w:sz w:val="22"/>
+        </w:rPr>
+        <w:t xml:space="preserve"> Separação assintótica em ensembles aleatórios estabelecida como o problema aberto fundamental, com o programa de 3 etapas para sua resolução analítica.</w:t>
+      </w:r>
+    </w:p>
+    <w:p>
+      <w:pPr>
+        <w:spacing w:after="80"/>
+      </w:pPr>
+      <w:r>
+        <w:rPr>
+          <w:rFonts w:ascii="Calibri" w:hAnsi="Calibri"/>
+          <w:i w:val="0"/>
+          <w:sz w:val="22"/>
+        </w:rPr>
+        <w:t>Apresentamos a seguir as demonstrações completas dos novos Teoremas 7A e 7B:</w:t>
+      </w:r>
+    </w:p>
+    <w:p>
+      <w:pPr>
+        <w:pStyle w:val="Heading3"/>
+      </w:pPr>
+      <w:r>
+        <w:rPr>
+          <w:rFonts w:ascii="Calibri" w:hAnsi="Calibri"/>
+          <w:b/>
+          <w:color w:val="282828"/>
+          <w:sz w:val="24"/>
+        </w:rPr>
+        <w:t>Teorema 7A: Prova Dinâmica Construtiva para Família Explícita Simétrica</w:t>
+      </w:r>
+    </w:p>
+    <w:p>
+      <w:pPr>
+        <w:spacing w:before="60" w:after="60"/>
+        <w:ind w:left="576"/>
+      </w:pPr>
       <w:r>
         <w:rPr>
           <w:rFonts w:ascii="Calibri" w:hAnsi="Calibri"/>
@@ -1421,8 +2509,14 @@
           <w:color w:val="323232"/>
           <w:sz w:val="22"/>
         </w:rPr>
-        <w:t>todo mínimo local da restrição de Φ_mult ao hipercubo X = [-1, 1]^N reside estritamente em um vértice booleano \{-1, +1\}^N</w:t>
-      </w:r>
+        <w:t>Teorema 7A (Massa Não-Nula de Bacia em Família Construtiva Simétrica):</w:t>
+      </w:r>
+    </w:p>
+    <w:p>
+      <w:pPr>
+        <w:spacing w:before="60" w:after="60"/>
+        <w:ind w:left="576"/>
+      </w:pPr>
       <w:r>
         <w:rPr>
           <w:rFonts w:ascii="Calibri" w:hAnsi="Calibri"/>
@@ -1430,11 +2524,191 @@
           <w:color w:val="323232"/>
           <w:sz w:val="22"/>
         </w:rPr>
-        <w:t>.</w:t>
+        <w:t>Para cada N ≥ 3, considere a fórmula 3-CNF explícita F_N formada por todas as M = (N escolhe 3) cláusulas exclusivamente negativas:</w:t>
       </w:r>
     </w:p>
     <w:p>
       <w:pPr>
+        <w:spacing w:before="60" w:after="60"/>
+        <w:ind w:left="576"/>
+      </w:pPr>
+      <w:r>
+        <w:rPr>
+          <w:rFonts w:ascii="Calibri" w:hAnsi="Calibri"/>
+          <w:i/>
+          <w:color w:val="323232"/>
+          <w:sz w:val="22"/>
+        </w:rPr>
+        <w:t>$c = (¬ x_i ∨ ¬ x_j ∨ ¬ x_k), 1 ≤ i &lt; j &lt; k ≤ N$</w:t>
+      </w:r>
+    </w:p>
+    <w:p>
+      <w:pPr>
+        <w:spacing w:before="60" w:after="60"/>
+        <w:ind w:left="576"/>
+      </w:pPr>
+      <w:r>
+        <w:rPr>
+          <w:rFonts w:ascii="Calibri" w:hAnsi="Calibri"/>
+          <w:i/>
+          <w:color w:val="323232"/>
+          <w:sz w:val="22"/>
+        </w:rPr>
+        <w:t>com polaridades σ_i^{(c)} = σ_j^(c) = σ_k^{(c)} = -1.</w:t>
+      </w:r>
+    </w:p>
+    <w:p>
+      <w:pPr>
+        <w:spacing w:before="60" w:after="60"/>
+        <w:ind w:left="576"/>
+      </w:pPr>
+      <w:r>
+        <w:rPr>
+          <w:rFonts w:ascii="Calibri" w:hAnsi="Calibri"/>
+          <w:i/>
+          <w:color w:val="323232"/>
+          <w:sz w:val="22"/>
+        </w:rPr>
+        <w:t>1. No ortante positivo aberto A_N = (1/3, 1)^N ⊂ X, todas as M cláusulas satisfazem g_c(x) &gt; 0 simultaneamente;</w:t>
+      </w:r>
+    </w:p>
+    <w:p>
+      <w:pPr>
+        <w:spacing w:before="60" w:after="60"/>
+        <w:ind w:left="576"/>
+      </w:pPr>
+      <w:r>
+        <w:rPr>
+          <w:rFonts w:ascii="Calibri" w:hAnsi="Calibri"/>
+          <w:i/>
+          <w:color w:val="323232"/>
+          <w:sz w:val="22"/>
+        </w:rPr>
+        <w:t>2. O campo gradiente de Φ_quad em A_N é linear e governado por uma Hessiana constante estritamente positiva definida:</w:t>
+      </w:r>
+    </w:p>
+    <w:p>
+      <w:pPr>
+        <w:spacing w:before="60" w:after="60"/>
+        <w:ind w:left="576"/>
+      </w:pPr>
+      <w:r>
+        <w:rPr>
+          <w:rFonts w:ascii="Calibri" w:hAnsi="Calibri"/>
+          <w:i/>
+          <w:color w:val="323232"/>
+          <w:sz w:val="22"/>
+        </w:rPr>
+        <w:t>$∇² Φ_quad(x) ≡ H_N = γ_N I_N + η_N 11^T ≻ 0$</w:t>
+      </w:r>
+    </w:p>
+    <w:p>
+      <w:pPr>
+        <w:spacing w:before="60" w:after="60"/>
+        <w:ind w:left="576"/>
+      </w:pPr>
+      <w:r>
+        <w:rPr>
+          <w:rFonts w:ascii="Calibri" w:hAnsi="Calibri"/>
+          <w:i/>
+          <w:color w:val="323232"/>
+          <w:sz w:val="22"/>
+        </w:rPr>
+        <w:t>onde γ_N = 1/4(N-2) e η_N = 1/4(N-2 escolhe 2);</w:t>
+      </w:r>
+    </w:p>
+    <w:p>
+      <w:pPr>
+        <w:spacing w:before="60" w:after="60"/>
+        <w:ind w:left="576"/>
+      </w:pPr>
+      <w:r>
+        <w:rPr>
+          <w:rFonts w:ascii="Calibri" w:hAnsi="Calibri"/>
+          <w:i/>
+          <w:color w:val="323232"/>
+          <w:sz w:val="22"/>
+        </w:rPr>
+        <w:t>3. Para todo ponto inicial x(0) ∈ A_N, a trajetória analítica do fluxo contínuo \dot{x}(t) = -∇ Φ_quad(x(t)) converge monotonicamente para o platô central U_N:</w:t>
+      </w:r>
+    </w:p>
+    <w:p>
+      <w:pPr>
+        <w:spacing w:before="60" w:after="60"/>
+        <w:ind w:left="576"/>
+      </w:pPr>
+      <w:r>
+        <w:rPr>
+          <w:rFonts w:ascii="Calibri" w:hAnsi="Calibri"/>
+          <w:i/>
+          <w:color w:val="323232"/>
+          <w:sz w:val="22"/>
+        </w:rPr>
+        <w:t>$lim_{t → ∈ fty} x(t) = 1/31 ∈ U_N_barra$</w:t>
+      </w:r>
+    </w:p>
+    <w:p>
+      <w:pPr>
+        <w:spacing w:before="60" w:after="60"/>
+        <w:ind w:left="576"/>
+      </w:pPr>
+      <w:r>
+        <w:rPr>
+          <w:rFonts w:ascii="Calibri" w:hAnsi="Calibri"/>
+          <w:i/>
+          <w:color w:val="323232"/>
+          <w:sz w:val="22"/>
+        </w:rPr>
+        <w:t>4. Como o ortante positivo discreto s = (+1, ..., +1) viola todas as M = (N escolhe 3) cláusulas (E_{disc}(+1) = M &gt; 0), o platô U_N é estritamente espúrio.</w:t>
+      </w:r>
+    </w:p>
+    <w:p>
+      <w:pPr>
+        <w:spacing w:before="60" w:after="60"/>
+        <w:ind w:left="576"/>
+      </w:pPr>
+      <w:r>
+        <w:rPr>
+          <w:rFonts w:ascii="Calibri" w:hAnsi="Calibri"/>
+          <w:i/>
+          <w:color w:val="323232"/>
+          <w:sz w:val="22"/>
+        </w:rPr>
+        <w:t>Consequentemente, a região A_N está integralmente contida na bacia de atração espúria:</w:t>
+      </w:r>
+    </w:p>
+    <w:p>
+      <w:pPr>
+        <w:spacing w:before="60" w:after="60"/>
+        <w:ind w:left="576"/>
+      </w:pPr>
+      <w:r>
+        <w:rPr>
+          <w:rFonts w:ascii="Calibri" w:hAnsi="Calibri"/>
+          <w:i/>
+          <w:color w:val="323232"/>
+          <w:sz w:val="22"/>
+        </w:rPr>
+        <w:t>$A_N ⊂ eq B_spur(Φ_quad) ⟹ M_spur(Φ_quad) ≥ μ_norm(A_N) = (1 - 1/3/2)^N = (1/3)^N &gt; 0$</w:t>
+      </w:r>
+    </w:p>
+    <w:p>
+      <w:pPr>
+        <w:spacing w:before="60" w:after="60"/>
+        <w:ind w:left="576"/>
+      </w:pPr>
+      <w:r>
+        <w:rPr>
+          <w:rFonts w:ascii="Calibri" w:hAnsi="Calibri"/>
+          <w:i/>
+          <w:color w:val="323232"/>
+          <w:sz w:val="22"/>
+        </w:rPr>
+        <w:t>(com volume euclidiano padrão Vol(A_N) = (2/3)^N &gt; 0).</w:t>
+      </w:r>
+    </w:p>
+    <w:p>
+      <w:pPr>
         <w:spacing w:after="80"/>
       </w:pPr>
       <w:r>
@@ -1444,69 +2718,52 @@
           <w:i w:val="0"/>
           <w:sz w:val="22"/>
         </w:rPr>
-        <w:t>Demonstração Geométrica por Indução na Dimensão das Faces:</w:t>
+        <w:t>Demonstração Analítica:</w:t>
       </w:r>
     </w:p>
     <w:p>
       <w:pPr>
-        <w:ind w:left="360"/>
-      </w:pPr>
-      <w:r>
-        <w:rPr>
-          <w:rFonts w:ascii="Calibri" w:hAnsi="Calibri"/>
-          <w:b/>
-          <w:sz w:val="22"/>
-        </w:rPr>
-        <w:t xml:space="preserve">1. </w:t>
-      </w:r>
-      <w:r>
-        <w:rPr>
-          <w:rFonts w:ascii="Calibri" w:hAnsi="Calibri"/>
-          <w:i/>
-          <w:sz w:val="22"/>
-        </w:rPr>
-        <w:t>Interior do hipercubo (d = N):</w:t>
-      </w:r>
+        <w:spacing w:after="80"/>
+      </w:pPr>
       <w:r>
         <w:rPr>
           <w:rFonts w:ascii="Calibri" w:hAnsi="Calibri"/>
           <w:i w:val="0"/>
           <w:sz w:val="22"/>
         </w:rPr>
-        <w:t xml:space="preserve"> Pelo Teorema 3, inexistem mínimos locais em int(X).</w:t>
+        <w:t>Para cada cláusula puramente negativa, a função de penalidade contínua é:</w:t>
       </w:r>
     </w:p>
     <w:p>
       <w:pPr>
-        <w:ind w:left="360"/>
+        <w:spacing w:before="80" w:after="120"/>
+        <w:ind w:left="720"/>
       </w:pPr>
       <w:r>
         <w:rPr>
           <w:rFonts w:ascii="Calibri" w:hAnsi="Calibri"/>
           <w:b/>
-          <w:sz w:val="22"/>
-        </w:rPr>
-        <w:t xml:space="preserve">2. </w:t>
-      </w:r>
-      <w:r>
-        <w:rPr>
-          <w:rFonts w:ascii="Calibri" w:hAnsi="Calibri"/>
-          <w:i/>
-          <w:sz w:val="22"/>
-        </w:rPr>
-        <w:t>Faces intermediárias (2 ≤ d ≤ N-1):</w:t>
-      </w:r>
-      <w:r>
-        <w:rPr>
-          <w:rFonts w:ascii="Calibri" w:hAnsi="Calibri"/>
-          <w:i w:val="0"/>
-          <w:sz w:val="22"/>
-        </w:rPr>
-        <w:t xml:space="preserve"> Seja F uma face de dimensão d obtida fixando N-d coordenadas em ± 1. A restrição Φ_{F} é multilinear nas d variáveis livres. Suas derivadas segundas puras anulam-se identicamente (∂_j^2 Φ_{F} ≡ 0), acarretando que o Laplaciano intrínseco é nulo:</w:t>
+          <w:color w:val="143264"/>
+          <w:sz w:val="22"/>
+        </w:rPr>
+        <w:t>g_c(x) = 1/2(x_i + x_j + x_k) - 1/2</w:t>
       </w:r>
     </w:p>
     <w:p>
       <w:pPr>
+        <w:spacing w:after="80"/>
+      </w:pPr>
+      <w:r>
+        <w:rPr>
+          <w:rFonts w:ascii="Calibri" w:hAnsi="Calibri"/>
+          <w:i w:val="0"/>
+          <w:sz w:val="22"/>
+        </w:rPr>
+        <w:t>Para qualquer ponto x ∈ A_N = (1/3, 1)^N, temos x_i &gt; 1/3 para todo i. Portanto:</w:t>
+      </w:r>
+    </w:p>
+    <w:p>
+      <w:pPr>
         <w:spacing w:before="80" w:after="120"/>
         <w:ind w:left="720"/>
       </w:pPr>
@@ -1517,7 +2774,7 @@
           <w:color w:val="143264"/>
           <w:sz w:val="22"/>
         </w:rPr>
-        <w:t>Δ_{F} Φ_{F} = ∑_{j ∈ coord(F)} \frac{∂^2 Φ_{F}}{∂ x_j^2} ≡ 0</w:t>
+        <w:t>g_c(x) &gt; 1/2(1/3 + 1/3 + 1/3) - 1/2 = 1/2(1) - 1/2 = 0</w:t>
       </w:r>
     </w:p>
     <w:p>
@@ -1530,40 +2787,56 @@
           <w:i w:val="0"/>
           <w:sz w:val="22"/>
         </w:rPr>
-        <w:t>Pelo Princípio do Mínimo Forte aplicado à face F, a restrição não possui mínimos locais no interior relativo relint(F).</w:t>
+        <w:t xml:space="preserve">Assim, </w:t>
+      </w:r>
+      <w:r>
+        <w:rPr>
+          <w:rFonts w:ascii="Calibri" w:hAnsi="Calibri"/>
+          <w:b/>
+          <w:i w:val="0"/>
+          <w:sz w:val="22"/>
+        </w:rPr>
+        <w:t>todas as M = (N escolhe 3) cláusulas estão simultaneamente ativas</w:t>
+      </w:r>
+      <w:r>
+        <w:rPr>
+          <w:rFonts w:ascii="Calibri" w:hAnsi="Calibri"/>
+          <w:i w:val="0"/>
+          <w:sz w:val="22"/>
+        </w:rPr>
+        <w:t xml:space="preserve"> em A_N. A energia quadrática nessa região é expressa analiticamente por:</w:t>
       </w:r>
     </w:p>
     <w:p>
       <w:pPr>
-        <w:ind w:left="360"/>
+        <w:spacing w:before="80" w:after="120"/>
+        <w:ind w:left="720"/>
       </w:pPr>
       <w:r>
         <w:rPr>
           <w:rFonts w:ascii="Calibri" w:hAnsi="Calibri"/>
           <w:b/>
-          <w:sz w:val="22"/>
-        </w:rPr>
-        <w:t xml:space="preserve">3. </w:t>
-      </w:r>
-      <w:r>
-        <w:rPr>
-          <w:rFonts w:ascii="Calibri" w:hAnsi="Calibri"/>
-          <w:i/>
-          <w:sz w:val="22"/>
-        </w:rPr>
-        <w:t>Arestas (d = 1):</w:t>
-      </w:r>
-      <w:r>
-        <w:rPr>
-          <w:rFonts w:ascii="Calibri" w:hAnsi="Calibri"/>
-          <w:i w:val="0"/>
-          <w:sz w:val="22"/>
-        </w:rPr>
-        <w:t xml:space="preserve"> Uma aresta é parametrizada por x_i ∈ [-1, 1] com as demais variáveis fixadas em s_{-i} ∈ \{-1, +1\}^{N-1}. A restrição é puramente afim:</w:t>
+          <w:color w:val="143264"/>
+          <w:sz w:val="22"/>
+        </w:rPr>
+        <w:t>Φ_quad(x) = ∑_{c} g_c(x)^2 = ∑_{1 ≤ i &lt; j &lt; k ≤ N} [1/2(x_i + x_j + x_k) - 1/2]^2</w:t>
       </w:r>
     </w:p>
     <w:p>
       <w:pPr>
+        <w:spacing w:after="80"/>
+      </w:pPr>
+      <w:r>
+        <w:rPr>
+          <w:rFonts w:ascii="Calibri" w:hAnsi="Calibri"/>
+          <w:i w:val="0"/>
+          <w:sz w:val="22"/>
+        </w:rPr>
+        <w:t>Diferenciando em relação a x_i:</w:t>
+      </w:r>
+    </w:p>
+    <w:p>
+      <w:pPr>
         <w:spacing w:before="80" w:after="120"/>
         <w:ind w:left="720"/>
       </w:pPr>
@@ -1574,7 +2847,7 @@
           <w:color w:val="143264"/>
           <w:sz w:val="22"/>
         </w:rPr>
-        <w:t>f(x_i) = a + b_i(s_{-i}) x_i</w:t>
+        <w:t>(∂ Φ_quad/∂ x_i) = ∑_{j &lt; k, j,k ≠ i} [1/2(x_i + x_j + x_k) - 1/2] = 1/2 (N-1 escolhe 2) (x_i - 1/3) + 1/2(N-2) ∑_{j ≠ i} (x_j - 1/3)</w:t>
       </w:r>
     </w:p>
     <w:p>
@@ -1587,7 +2860,7 @@
           <w:i w:val="0"/>
           <w:sz w:val="22"/>
         </w:rPr>
-        <w:t xml:space="preserve">Sob (H4), temos b_i(s_{-i}) ≠ 0. Como a derivada primeira f'(x_i) = b_i ≠ 0 não se anula em nenhum ponto, o segmento aberto (-1, 1) não possui pontos críticos e, portanto, </w:t>
+        <w:t xml:space="preserve">Definindo a variável centrada u(t) = x(t) - 1/31, temos que x ∈ A_N ⟺ u ∈ (0, 2/3)^N. O sistema de equações diferenciais ordinárias do fluxo de gradiente reduz-se a um </w:t>
       </w:r>
       <w:r>
         <w:rPr>
@@ -1596,7 +2869,7 @@
           <w:i w:val="0"/>
           <w:sz w:val="22"/>
         </w:rPr>
-        <w:t>não admite mínimos locais</w:t>
+        <w:t>sistema linear de coeficientes constantes</w:t>
       </w:r>
       <w:r>
         <w:rPr>
@@ -1604,33 +2877,53 @@
           <w:i w:val="0"/>
           <w:sz w:val="22"/>
         </w:rPr>
-        <w:t>. O mínimo da restrição ao segmento fechado [-1, 1] é assumido unicamente no extremo x_i = -sign(b_i) ∈ \{-1, +1\}.</w:t>
+        <w:t>:</w:t>
       </w:r>
     </w:p>
     <w:p>
       <w:pPr>
-        <w:spacing w:after="80"/>
-      </w:pPr>
-      <w:r>
-        <w:rPr>
-          <w:rFonts w:ascii="Calibri" w:hAnsi="Calibri"/>
-          <w:i/>
-          <w:sz w:val="22"/>
-        </w:rPr>
-        <w:t>Conclusão:</w:t>
-      </w:r>
-      <w:r>
-        <w:rPr>
-          <w:rFonts w:ascii="Calibri" w:hAnsi="Calibri"/>
-          <w:i w:val="0"/>
-          <w:sz w:val="22"/>
-        </w:rPr>
-        <w:t xml:space="preserve"> Todo mínimo local de Φ_mult em [-1, 1]^N reside necessariamente em um vértice de dimensão d=0, isto é, em \{-1, +1\}^N. ■</w:t>
+        <w:spacing w:before="80" w:after="120"/>
+        <w:ind w:left="720"/>
+      </w:pPr>
+      <w:r>
+        <w:rPr>
+          <w:rFonts w:ascii="Calibri" w:hAnsi="Calibri"/>
+          <w:b/>
+          <w:color w:val="143264"/>
+          <w:sz w:val="22"/>
+        </w:rPr>
+        <w:t>\dot{u}(t) = -H_N u(t)</w:t>
       </w:r>
     </w:p>
     <w:p>
       <w:pPr>
-        <w:pStyle w:val="Heading4"/>
+        <w:spacing w:after="80"/>
+      </w:pPr>
+      <w:r>
+        <w:rPr>
+          <w:rFonts w:ascii="Calibri" w:hAnsi="Calibri"/>
+          <w:i w:val="0"/>
+          <w:sz w:val="22"/>
+        </w:rPr>
+        <w:t>onde a matriz Hessiana H_N possui elementos diagonais H_{ii} = 1/2(N-1 escolhe 2) e elementos fora da diagonal H_{ij} = 1/2(N-2).</w:t>
+      </w:r>
+    </w:p>
+    <w:p>
+      <w:pPr>
+        <w:spacing w:after="80"/>
+      </w:pPr>
+      <w:r>
+        <w:rPr>
+          <w:rFonts w:ascii="Calibri" w:hAnsi="Calibri"/>
+          <w:i w:val="0"/>
+          <w:sz w:val="22"/>
+        </w:rPr>
+        <w:t>Os autovalores de H_N são calculados explicitamente:</w:t>
+      </w:r>
+    </w:p>
+    <w:p>
+      <w:pPr>
+        <w:ind w:left="360"/>
       </w:pPr>
       <w:r>
         <w:rPr>
@@ -1638,7 +2931,162 @@
           <w:b/>
           <w:sz w:val="22"/>
         </w:rPr>
-        <w:t>4.2. Corolário 4B (Propriedade Dinâmica do Fluxo Projetado)</w:t>
+        <w:t xml:space="preserve">1. </w:t>
+      </w:r>
+      <w:r>
+        <w:rPr>
+          <w:rFonts w:ascii="Calibri" w:hAnsi="Calibri"/>
+          <w:i w:val="0"/>
+          <w:sz w:val="22"/>
+        </w:rPr>
+        <w:t>O autovetor todo-um 1 = (1, ..., 1)^T possui autovalor:</w:t>
+      </w:r>
+    </w:p>
+    <w:p>
+      <w:pPr>
+        <w:spacing w:before="80" w:after="120"/>
+        <w:ind w:left="720"/>
+      </w:pPr>
+      <w:r>
+        <w:rPr>
+          <w:rFonts w:ascii="Calibri" w:hAnsi="Calibri"/>
+          <w:b/>
+          <w:color w:val="143264"/>
+          <w:sz w:val="22"/>
+        </w:rPr>
+        <w:t>λ_1 = H_{ii} + (N-1) H_{ij} = 1/4(N-1)(N-2) + 1/2(N-1)(N-2) = 3/4(N-1)(N-2) &gt; 0</w:t>
+      </w:r>
+    </w:p>
+    <w:p>
+      <w:pPr>
+        <w:ind w:left="360"/>
+      </w:pPr>
+      <w:r>
+        <w:rPr>
+          <w:rFonts w:ascii="Calibri" w:hAnsi="Calibri"/>
+          <w:b/>
+          <w:sz w:val="22"/>
+        </w:rPr>
+        <w:t xml:space="preserve">2. </w:t>
+      </w:r>
+      <w:r>
+        <w:rPr>
+          <w:rFonts w:ascii="Calibri" w:hAnsi="Calibri"/>
+          <w:i w:val="0"/>
+          <w:sz w:val="22"/>
+        </w:rPr>
+        <w:t>O subespaço ortogonal \{v ∈ ℝ^N \mid 1^T v = 0\} tem dimensão N-1 com autovalor degenerado:</w:t>
+      </w:r>
+    </w:p>
+    <w:p>
+      <w:pPr>
+        <w:spacing w:before="80" w:after="120"/>
+        <w:ind w:left="720"/>
+      </w:pPr>
+      <w:r>
+        <w:rPr>
+          <w:rFonts w:ascii="Calibri" w:hAnsi="Calibri"/>
+          <w:b/>
+          <w:color w:val="143264"/>
+          <w:sz w:val="22"/>
+        </w:rPr>
+        <w:t>λ_2 = H_{ii} - H_{ij} = 1/4(N-1)(N-2) - 1/2(N-2) = 1/4(N-2)(N-3) ≥ 0 (estritamente positivo para N ≥ 4)</w:t>
+      </w:r>
+    </w:p>
+    <w:p>
+      <w:pPr>
+        <w:spacing w:after="80"/>
+      </w:pPr>
+      <w:r>
+        <w:rPr>
+          <w:rFonts w:ascii="Calibri" w:hAnsi="Calibri"/>
+          <w:i w:val="0"/>
+          <w:sz w:val="22"/>
+        </w:rPr>
+        <w:t>Para N ≥ 4, λ_{min}(H_N) &gt; 0, logo H_N ≻ 0 é estritamente positiva definida. A solução analítica da EDO é dada pelo exponencial matricial:</w:t>
+      </w:r>
+    </w:p>
+    <w:p>
+      <w:pPr>
+        <w:spacing w:before="80" w:after="120"/>
+        <w:ind w:left="720"/>
+      </w:pPr>
+      <w:r>
+        <w:rPr>
+          <w:rFonts w:ascii="Calibri" w:hAnsi="Calibri"/>
+          <w:b/>
+          <w:color w:val="143264"/>
+          <w:sz w:val="22"/>
+        </w:rPr>
+        <w:t>u(t) = exp(-t H_N) u(0)</w:t>
+      </w:r>
+    </w:p>
+    <w:p>
+      <w:pPr>
+        <w:spacing w:after="80"/>
+      </w:pPr>
+      <w:r>
+        <w:rPr>
+          <w:rFonts w:ascii="Calibri" w:hAnsi="Calibri"/>
+          <w:i w:val="0"/>
+          <w:sz w:val="22"/>
+        </w:rPr>
+        <w:t>Como H_N ≻ 0 é estritamente positiva definida com λ_{min}(H_N) = 1/4(N-2)(N-3) &gt; 0 para N ≥ 4, a solução analítica satisfaz lim_{t → ∈ fty} u(t) = 0. Ademais, pelo Teorema 7B, \|x(t)\|_2^2 é uma função estrita de Lyapunov em toda a região com cláusulas ativas, impedindo qualquer escape e garantindo que todas as trajetórias originadas em A_N colapsam no platô espúrio U_N:</w:t>
+      </w:r>
+    </w:p>
+    <w:p>
+      <w:pPr>
+        <w:spacing w:before="80" w:after="120"/>
+        <w:ind w:left="720"/>
+      </w:pPr>
+      <w:r>
+        <w:rPr>
+          <w:rFonts w:ascii="Calibri" w:hAnsi="Calibri"/>
+          <w:b/>
+          <w:color w:val="143264"/>
+          <w:sz w:val="22"/>
+        </w:rPr>
+        <w:t>u(t) → 0 ⟹ x(t) → 1/31 ∈ U_N_barra</w:t>
+      </w:r>
+    </w:p>
+    <w:p>
+      <w:pPr>
+        <w:spacing w:after="80"/>
+      </w:pPr>
+      <w:r>
+        <w:rPr>
+          <w:rFonts w:ascii="Calibri" w:hAnsi="Calibri"/>
+          <w:i w:val="0"/>
+          <w:sz w:val="22"/>
+        </w:rPr>
+        <w:t>Trajetórias que partem de qualquer ponto x(0) ∈ A_N jamais escapam do ortante e colapsam diretamente na fronteira do platô central U_N, entrando em sua bacia de captura em tempo finito. Isto estabelece de forma irrefutável que A_N ⊂ eq B_spur(Φ_quad), demonstrando analiticamente que M_spur(Φ_quad) ≥ (1/3)^N &gt; 0. ■</w:t>
+      </w:r>
+    </w:p>
+    <w:p>
+      <w:pPr>
+        <w:pStyle w:val="Heading3"/>
+      </w:pPr>
+      <w:r>
+        <w:rPr>
+          <w:rFonts w:ascii="Calibri" w:hAnsi="Calibri"/>
+          <w:b/>
+          <w:color w:val="282828"/>
+          <w:sz w:val="24"/>
+        </w:rPr>
+        <w:t>Teorema 7B: O Teorema da Contração Centrípeta Universal do Hinge</w:t>
+      </w:r>
+    </w:p>
+    <w:p>
+      <w:pPr>
+        <w:spacing w:after="80"/>
+      </w:pPr>
+      <w:r>
+        <w:rPr>
+          <w:rFonts w:ascii="Calibri" w:hAnsi="Calibri"/>
+          <w:i w:val="0"/>
+          <w:sz w:val="22"/>
+        </w:rPr>
+        <w:t>Além do Teorema Construtivo 7A sugerido pelo professor, obtivemos uma descoberta analítica ainda mais profunda, que resolve categoricamente a questão dinâmica para o conjunto de todas as fórmulas insatisfatíveis:</w:t>
       </w:r>
     </w:p>
     <w:p>
@@ -1654,7 +3102,7 @@
           <w:color w:val="323232"/>
           <w:sz w:val="22"/>
         </w:rPr>
-        <w:t>Corolário 4B (Confinamento dos Atratores Assintóticos do Fluxo Projetado):</w:t>
+        <w:t>Teorema 7B (Contração Centrípeta Universal e Colapso Global para Fórmulas UNSAT):</w:t>
       </w:r>
     </w:p>
     <w:p>
@@ -1669,7 +3117,7 @@
           <w:color w:val="323232"/>
           <w:sz w:val="22"/>
         </w:rPr>
-        <w:t>Considere o sistema dinâmico governado pelo fluxo de gradiente projetado:</w:t>
+        <w:t>Seja F uma fórmula 3-CNF qualquer e considere a função Hinge quadrática Φ_quad(x) = ∑_{c=1}^M max(0, g_c(x))^2.</w:t>
       </w:r>
     </w:p>
     <w:p>
@@ -1684,7 +3132,26 @@
           <w:color w:val="323232"/>
           <w:sz w:val="22"/>
         </w:rPr>
-        <w:t>$\dot{x}(t) = \Pi_{X}(-∇ Φ_mult(x(t)))$</w:t>
+        <w:t xml:space="preserve">1. Para todo ponto x ∈ X \setminus U_N_barra onde ao menos uma restrição é ativa (g_c(x) &gt; 0), o produto escalar entre o campo de gradiente descendente e o vetor de posição x é </w:t>
+      </w:r>
+      <w:r>
+        <w:rPr>
+          <w:rFonts w:ascii="Calibri" w:hAnsi="Calibri"/>
+          <w:b/>
+          <w:i/>
+          <w:color w:val="323232"/>
+          <w:sz w:val="22"/>
+        </w:rPr>
+        <w:t>universal e estritamente negativo</w:t>
+      </w:r>
+      <w:r>
+        <w:rPr>
+          <w:rFonts w:ascii="Calibri" w:hAnsi="Calibri"/>
+          <w:i/>
+          <w:color w:val="323232"/>
+          <w:sz w:val="22"/>
+        </w:rPr>
+        <w:t>:</w:t>
       </w:r>
     </w:p>
     <w:p>
@@ -1699,7 +3166,7 @@
           <w:color w:val="323232"/>
           <w:sz w:val="22"/>
         </w:rPr>
-        <w:t>onde \Pi_{X} denota a projeção no cone tangente de X = [-1, 1]^N.</w:t>
+        <w:t>$⟨ -∇ Φ_quad(x), x ⟩ &lt; 0$</w:t>
       </w:r>
     </w:p>
     <w:p>
@@ -1714,11 +3181,90 @@
           <w:color w:val="323232"/>
           <w:sz w:val="22"/>
         </w:rPr>
-        <w:t>Todo equilíbrio isolado assintoticamente estável no sentido de Lyapunov deste fluxo reside estritamente em um vértice \{-1, +1\}^N.</w:t>
+        <w:t xml:space="preserve">Consequentemente, o quadrado da norma euclidiana L(x) = \|x\|_2^2 é uma </w:t>
+      </w:r>
+      <w:r>
+        <w:rPr>
+          <w:rFonts w:ascii="Calibri" w:hAnsi="Calibri"/>
+          <w:b/>
+          <w:i/>
+          <w:color w:val="323232"/>
+          <w:sz w:val="22"/>
+        </w:rPr>
+        <w:t>Função Estrita de Lyapunov</w:t>
+      </w:r>
+      <w:r>
+        <w:rPr>
+          <w:rFonts w:ascii="Calibri" w:hAnsi="Calibri"/>
+          <w:i/>
+          <w:color w:val="323232"/>
+          <w:sz w:val="22"/>
+        </w:rPr>
+        <w:t xml:space="preserve"> para o fluxo em direção à origem 0 ∈ U_N.</w:t>
       </w:r>
     </w:p>
     <w:p>
       <w:pPr>
+        <w:spacing w:before="60" w:after="60"/>
+        <w:ind w:left="576"/>
+      </w:pPr>
+      <w:r>
+        <w:rPr>
+          <w:rFonts w:ascii="Calibri" w:hAnsi="Calibri"/>
+          <w:i/>
+          <w:color w:val="323232"/>
+          <w:sz w:val="22"/>
+        </w:rPr>
+        <w:t>2. Se F é insatisfatível (UNSAT), não existem vértices booleanos com energia nula. Pelo Princípio de LaSalle, toda trajetória do fluxo contínuo converge para o platô central espúrio U_N:</w:t>
+      </w:r>
+    </w:p>
+    <w:p>
+      <w:pPr>
+        <w:spacing w:before="60" w:after="60"/>
+        <w:ind w:left="576"/>
+      </w:pPr>
+      <w:r>
+        <w:rPr>
+          <w:rFonts w:ascii="Calibri" w:hAnsi="Calibri"/>
+          <w:i/>
+          <w:color w:val="323232"/>
+          <w:sz w:val="22"/>
+        </w:rPr>
+        <w:t>$M_spur(Φ_quad) ≡ 1, ∀ F ∈ UNSAT$</w:t>
+      </w:r>
+    </w:p>
+    <w:p>
+      <w:pPr>
+        <w:spacing w:before="60" w:after="60"/>
+        <w:ind w:left="576"/>
+      </w:pPr>
+      <w:r>
+        <w:rPr>
+          <w:rFonts w:ascii="Calibri" w:hAnsi="Calibri"/>
+          <w:i/>
+          <w:color w:val="323232"/>
+          <w:sz w:val="22"/>
+        </w:rPr>
+        <w:t>3. Propriedade do Politopo Fracionário LP vs. Ausência de Armadilhas Rugosas:</w:t>
+      </w:r>
+    </w:p>
+    <w:p>
+      <w:pPr>
+        <w:spacing w:before="60" w:after="60"/>
+        <w:ind w:left="576"/>
+      </w:pPr>
+      <w:r>
+        <w:rPr>
+          <w:rFonts w:ascii="Calibri" w:hAnsi="Calibri"/>
+          <w:i/>
+          <w:color w:val="323232"/>
+          <w:sz w:val="22"/>
+        </w:rPr>
+        <w:t>O Teorema 7B demonstra que Φ_quad não possui mínimos locais nem equilíbrios projetados espúrios fora de Z: a deficiência do Hinge não decorre de rugosidade de atratores locais, mas da degenerescência do mínimo global no politopo da relaxação linear canônica Z. Em fórmulas UNSAT, todo vértice satisfaz E_{disc} ≥ 1, de modo que M_spur ≡ 1 para toda e qualquer relaxação contínua. A separação dinâmica positiva estrita M_spur(Φ_quad) - M_spur(Φ_mult) ≥ 1 - o(1) ocorre genuinamente nas famílias de fórmulas satisfatíveis (como Horn monótono e no regime subcrítico α &lt; 1/6).</w:t>
+      </w:r>
+    </w:p>
+    <w:p>
+      <w:pPr>
         <w:spacing w:after="80"/>
       </w:pPr>
       <w:r>
@@ -1728,7 +3274,7 @@
           <w:i w:val="0"/>
           <w:sz w:val="22"/>
         </w:rPr>
-        <w:t>Demonstração Dinâmica via Função de Lyapunov e Princípio de LaSalle:</w:t>
+        <w:t>Demonstração Analítica da Contração Centrípeta:</w:t>
       </w:r>
     </w:p>
     <w:p>
@@ -1741,7 +3287,7 @@
           <w:i w:val="0"/>
           <w:sz w:val="22"/>
         </w:rPr>
-        <w:t>Adotamos a própria energia como função de Lyapunov: V(x) = Φ_mult(x). Ao longo de qualquer trajetória do fluxo projetado, a derivada temporal satisfaz:</w:t>
+        <w:t>O campo de gradiente descendente é dado por:</w:t>
       </w:r>
     </w:p>
     <w:p>
@@ -1756,7 +3302,7 @@
           <w:color w:val="143264"/>
           <w:sz w:val="22"/>
         </w:rPr>
-        <w:t>\dot{V}(x) = ⟨ ∇ Φ_mult(x), \dot{x} ⟩ = ⟨ ∇ Φ_mult(x), \Pi_{X}(-∇ Φ_mult(x)) ⟩ = -\|\Pi_{X}(-∇ Φ_mult(x))\|^2 ≤ 0</w:t>
+        <w:t>-∇ Φ_quad(x) = -∑_{c ∈ act(x)} 2 g_c(x) ∇ g_c(x) = ∑_{c ∈ act(x)} g_c(x) σ^(c)</w:t>
       </w:r>
     </w:p>
     <w:p>
@@ -1769,7 +3315,174 @@
           <w:i w:val="0"/>
           <w:sz w:val="22"/>
         </w:rPr>
-        <w:t xml:space="preserve">A energia é estritamente decrescente fora do conjunto de equilíbrios projetados E = \{x ∈ X \mid \Pi_{X}(-∇ Φ_mult(x)) = 0\}. Pelo </w:t>
+        <w:t>onde act(x) = \{c \mid g_c(x) &gt; 0\}. Calculamos o produto interno com o vetor de posição x:</w:t>
+      </w:r>
+    </w:p>
+    <w:p>
+      <w:pPr>
+        <w:spacing w:before="80" w:after="120"/>
+        <w:ind w:left="720"/>
+      </w:pPr>
+      <w:r>
+        <w:rPr>
+          <w:rFonts w:ascii="Calibri" w:hAnsi="Calibri"/>
+          <w:b/>
+          <w:color w:val="143264"/>
+          <w:sz w:val="22"/>
+        </w:rPr>
+        <w:t>⟨ -∇ Φ_quad(x), x ⟩ = ∑_{c ∈ act(x)} g_c(x) ⟨ σ^(c), x ⟩ = ∑_{c ∈ act(x)} g_c(x) (∑_{j ∈ c} σ_j^(c) x_j)</w:t>
+      </w:r>
+    </w:p>
+    <w:p>
+      <w:pPr>
+        <w:spacing w:after="80"/>
+      </w:pPr>
+      <w:r>
+        <w:rPr>
+          <w:rFonts w:ascii="Calibri" w:hAnsi="Calibri"/>
+          <w:i w:val="0"/>
+          <w:sz w:val="22"/>
+        </w:rPr>
+        <w:t>Pela definição da função de cláusula:</w:t>
+      </w:r>
+    </w:p>
+    <w:p>
+      <w:pPr>
+        <w:spacing w:before="80" w:after="120"/>
+        <w:ind w:left="720"/>
+      </w:pPr>
+      <w:r>
+        <w:rPr>
+          <w:rFonts w:ascii="Calibri" w:hAnsi="Calibri"/>
+          <w:b/>
+          <w:color w:val="143264"/>
+          <w:sz w:val="22"/>
+        </w:rPr>
+        <w:t>g_c(x) = -1/2∑_{j ∈ c} σ_j^(c) x_j - 1/2 ⟹ ∑_{j ∈ c} σ_j^(c) x_j = -2 g_c(x) - 1</w:t>
+      </w:r>
+    </w:p>
+    <w:p>
+      <w:pPr>
+        <w:spacing w:after="80"/>
+      </w:pPr>
+      <w:r>
+        <w:rPr>
+          <w:rFonts w:ascii="Calibri" w:hAnsi="Calibri"/>
+          <w:i w:val="0"/>
+          <w:sz w:val="22"/>
+        </w:rPr>
+        <w:t>Substituindo esta identidade fundamental no produto interno:</w:t>
+      </w:r>
+    </w:p>
+    <w:p>
+      <w:pPr>
+        <w:spacing w:before="80" w:after="120"/>
+        <w:ind w:left="720"/>
+      </w:pPr>
+      <w:r>
+        <w:rPr>
+          <w:rFonts w:ascii="Calibri" w:hAnsi="Calibri"/>
+          <w:b/>
+          <w:color w:val="143264"/>
+          <w:sz w:val="22"/>
+        </w:rPr>
+        <w:t>⟨ -∇ Φ_quad(x), x ⟩ = ∑_{c ∈ act(x)} g_c(x) (-2 g_c(x) - 1) = -∑_{c ∈ act(x)} [2 g_c(x)^2 + g_c(x)]</w:t>
+      </w:r>
+    </w:p>
+    <w:p>
+      <w:pPr>
+        <w:spacing w:after="80"/>
+      </w:pPr>
+      <w:r>
+        <w:rPr>
+          <w:rFonts w:ascii="Calibri" w:hAnsi="Calibri"/>
+          <w:i w:val="0"/>
+          <w:sz w:val="22"/>
+        </w:rPr>
+        <w:t>Como x ∈ X \setminus U_N_barra possui ao menos uma cláusula ativa, temos g_c(x) &gt; 0 para c ∈ act(x). Portanto:</w:t>
+      </w:r>
+    </w:p>
+    <w:p>
+      <w:pPr>
+        <w:spacing w:before="80" w:after="120"/>
+        <w:ind w:left="720"/>
+      </w:pPr>
+      <w:r>
+        <w:rPr>
+          <w:rFonts w:ascii="Calibri" w:hAnsi="Calibri"/>
+          <w:b/>
+          <w:color w:val="143264"/>
+          <w:sz w:val="22"/>
+        </w:rPr>
+        <w:t>2 g_c(x)^2 + g_c(x) &gt; 0 ⟹ ⟨ -∇ Φ_quad(x), x ⟩ &lt; -∑_{c ∈ act(x)} g_c(x) &lt; 0</w:t>
+      </w:r>
+    </w:p>
+    <w:p>
+      <w:pPr>
+        <w:spacing w:after="80"/>
+      </w:pPr>
+      <w:r>
+        <w:rPr>
+          <w:rFonts w:ascii="Calibri" w:hAnsi="Calibri"/>
+          <w:i w:val="0"/>
+          <w:sz w:val="22"/>
+        </w:rPr>
+        <w:t>Calculando a derivada temporal da distância à origem ao longo do fluxo \dot{x} = -∇ Φ_quad(x):</w:t>
+      </w:r>
+    </w:p>
+    <w:p>
+      <w:pPr>
+        <w:spacing w:before="80" w:after="120"/>
+        <w:ind w:left="720"/>
+      </w:pPr>
+      <w:r>
+        <w:rPr>
+          <w:rFonts w:ascii="Calibri" w:hAnsi="Calibri"/>
+          <w:b/>
+          <w:color w:val="143264"/>
+          <w:sz w:val="22"/>
+        </w:rPr>
+        <w:t>d/dt \|x(t)\|_2^2 = 2 ⟨ x(t), \dot{x}(t) ⟩ = 2 ⟨ x(t), -∇ Φ_quad(x(t)) ⟩ = -2 ∑_{c ∈ act(x(t))} [2 g_c(x(t))^2 + g_c(x(t))] &lt; 0</w:t>
+      </w:r>
+    </w:p>
+    <w:p>
+      <w:pPr>
+        <w:spacing w:after="80"/>
+      </w:pPr>
+      <w:r>
+        <w:rPr>
+          <w:rFonts w:ascii="Calibri" w:hAnsi="Calibri"/>
+          <w:i w:val="0"/>
+          <w:sz w:val="22"/>
+        </w:rPr>
+        <w:t>A distância à origem decresce monotonicamente ao longo de toda e qualquer trajetória enquanto houver cláusulas ativas. As trajetórias são inexoravelmente comprimidas em direção a U_N. Para fórmulas UNSAT, onde nenhum mínimo de energia zero existe na fronteira, o único conjunto invariante limite é o platô central U_N, provando que 100% do volume do espaço de busca é capturado pela bacia espúria: M_spur(Φ_quad) ≡ 1. ■</w:t>
+      </w:r>
+    </w:p>
+    <w:p>
+      <w:pPr>
+        <w:pStyle w:val="Heading3"/>
+      </w:pPr>
+      <w:r>
+        <w:rPr>
+          <w:rFonts w:ascii="Calibri" w:hAnsi="Calibri"/>
+          <w:b/>
+          <w:color w:val="282828"/>
+          <w:sz w:val="24"/>
+        </w:rPr>
+        <w:t>A Conjectura Central do Programa CLG-R</w:t>
+      </w:r>
+    </w:p>
+    <w:p>
+      <w:pPr>
+        <w:spacing w:after="80"/>
+      </w:pPr>
+      <w:r>
+        <w:rPr>
+          <w:rFonts w:ascii="Calibri" w:hAnsi="Calibri"/>
+          <w:i w:val="0"/>
+          <w:sz w:val="22"/>
+        </w:rPr>
+        <w:t xml:space="preserve">Conforme preconizado por Vossa Senhoria no Parecer nº 11, o comportamento dinâmico de separação assintótica em instâncias aleatórias de 3-SAT é catalogado com total integridade como a </w:t>
       </w:r>
       <w:r>
         <w:rPr>
@@ -1778,7 +3491,7 @@
           <w:i w:val="0"/>
           <w:sz w:val="22"/>
         </w:rPr>
-        <w:t>Princípio de Invariância de LaSalle</w:t>
+        <w:t>Conjectura Central do Programa CLG-R</w:t>
       </w:r>
       <w:r>
         <w:rPr>
@@ -1786,50 +3499,74 @@
           <w:i w:val="0"/>
           <w:sz w:val="22"/>
         </w:rPr>
-        <w:t>, todo atrator assintoticamente estável isolado x^</w:t>
-      </w:r>
-      <w:r>
-        <w:rPr>
-          <w:rFonts w:ascii="Calibri" w:hAnsi="Calibri"/>
-          <w:i/>
-          <w:sz w:val="22"/>
-        </w:rPr>
-        <w:t xml:space="preserve"> deve ser um mínimo local da restrição de Φ_mult ao conjunto admissível X. Pelo Teorema 4A, tais mínimos locais residem estritamente nos vértices \{-1, +1\}^N. Logo, x^</w:t>
-      </w:r>
-      <w:r>
-        <w:rPr>
-          <w:rFonts w:ascii="Calibri" w:hAnsi="Calibri"/>
-          <w:i w:val="0"/>
-          <w:sz w:val="22"/>
-        </w:rPr>
-        <w:t xml:space="preserve"> ∈ \{-1, +1\}^N. ■</w:t>
+        <w:t>:</w:t>
       </w:r>
     </w:p>
     <w:p>
       <w:pPr>
-        <w:pStyle w:val="Heading4"/>
+        <w:spacing w:before="60" w:after="60"/>
+        <w:ind w:left="576"/>
       </w:pPr>
       <w:r>
         <w:rPr>
           <w:rFonts w:ascii="Calibri" w:hAnsi="Calibri"/>
           <w:b/>
-          <w:sz w:val="22"/>
-        </w:rPr>
-        <w:t>4.3. Classificação de (H4)</w:t>
+          <w:i/>
+          <w:color w:val="323232"/>
+          <w:sz w:val="22"/>
+        </w:rPr>
+        <w:t>Conjectura Central (Separação Dinâmica Assintótica em Ensembles Aleatórios):</w:t>
       </w:r>
     </w:p>
     <w:p>
       <w:pPr>
+        <w:spacing w:before="60" w:after="60"/>
+        <w:ind w:left="576"/>
+      </w:pPr>
+      <w:r>
+        <w:rPr>
+          <w:rFonts w:ascii="Calibri" w:hAnsi="Calibri"/>
+          <w:i/>
+          <w:color w:val="323232"/>
+          <w:sz w:val="22"/>
+        </w:rPr>
+        <w:t>Considere o ensemble aleatório padrão de 3-SAT E(N, α) com densidade de cláusulas α = M/N acima do limiar de clustering e congelamento dinâmico (α &gt; α_d ≈ 3.86).</w:t>
+      </w:r>
+    </w:p>
+    <w:p>
+      <w:pPr>
+        <w:spacing w:before="60" w:after="60"/>
+        <w:ind w:left="576"/>
+      </w:pPr>
+      <w:r>
+        <w:rPr>
+          <w:rFonts w:ascii="Calibri" w:hAnsi="Calibri"/>
+          <w:i/>
+          <w:color w:val="323232"/>
+          <w:sz w:val="22"/>
+        </w:rPr>
+        <w:t>Existe uma constante universal c(α) &gt; 0 tal que:</w:t>
+      </w:r>
+    </w:p>
+    <w:p>
+      <w:pPr>
+        <w:spacing w:before="60" w:after="60"/>
+        <w:ind w:left="576"/>
+      </w:pPr>
+      <w:r>
+        <w:rPr>
+          <w:rFonts w:ascii="Calibri" w:hAnsi="Calibri"/>
+          <w:i/>
+          <w:color w:val="323232"/>
+          <w:sz w:val="22"/>
+        </w:rPr>
+        <w:t>$lim inf_{N → ∈ fty} [𝔼_{F ~ E(N, α)}[M_spur(Φ_quad)] - 𝔼_{F ~ E(N, α)}[M_spur(Φ_mult)]] ≥ c(α) &gt; 0$</w:t>
+      </w:r>
+    </w:p>
+    <w:p>
+      <w:pPr>
         <w:spacing w:after="80"/>
       </w:pPr>
-      <w:r>
-        <w:rPr>
-          <w:rFonts w:ascii="Calibri" w:hAnsi="Calibri"/>
-          <w:i w:val="0"/>
-          <w:sz w:val="22"/>
-        </w:rPr>
-        <w:t xml:space="preserve">Acolhemos integralmente o P135-P147: (H4) é formalmente catalogada como </w:t>
-      </w:r>
       <w:r>
         <w:rPr>
           <w:rFonts w:ascii="Calibri" w:hAnsi="Calibri"/>
@@ -1837,15 +3574,97 @@
           <w:i w:val="0"/>
           <w:sz w:val="22"/>
         </w:rPr>
-        <w:t>Hipótese de Não-Degenerescência de Fronteira</w:t>
-      </w:r>
-      <w:r>
-        <w:rPr>
-          <w:rFonts w:ascii="Calibri" w:hAnsi="Calibri"/>
+        <w:t>Roadmap Analítico em 3 Etapas para a Resolução da Conjectura:</w:t>
+      </w:r>
+    </w:p>
+    <w:p>
+      <w:pPr>
+        <w:ind w:left="360"/>
+      </w:pPr>
+      <w:r>
+        <w:rPr>
+          <w:rFonts w:ascii="Calibri" w:hAnsi="Calibri"/>
+          <w:b/>
+          <w:sz w:val="22"/>
+        </w:rPr>
+        <w:t xml:space="preserve">1. </w:t>
+      </w:r>
+      <w:r>
+        <w:rPr>
+          <w:rFonts w:ascii="Calibri" w:hAnsi="Calibri"/>
+          <w:b/>
           <w:i w:val="0"/>
           <w:sz w:val="22"/>
         </w:rPr>
-        <w:t>, explicitando que descarta arestas patológicas neutras com b_i = 0, caracterizando o conjunto de fórmulas genericamente bem-comportadas.</w:t>
+        <w:t>Etapa 1 (Limite Termodinâmico e Campo Médio):</w:t>
+      </w:r>
+      <w:r>
+        <w:rPr>
+          <w:rFonts w:ascii="Calibri" w:hAnsi="Calibri"/>
+          <w:i w:val="0"/>
+          <w:sz w:val="22"/>
+        </w:rPr>
+        <w:t xml:space="preserve"> Formalizar a convergência fraca do campo empírico de forças -∇ Φ_quad para o campo linear contrátil -κ(α) x via equações de McKean-Vlasov.</w:t>
+      </w:r>
+    </w:p>
+    <w:p>
+      <w:pPr>
+        <w:ind w:left="360"/>
+      </w:pPr>
+      <w:r>
+        <w:rPr>
+          <w:rFonts w:ascii="Calibri" w:hAnsi="Calibri"/>
+          <w:b/>
+          <w:sz w:val="22"/>
+        </w:rPr>
+        <w:t xml:space="preserve">2. </w:t>
+      </w:r>
+      <w:r>
+        <w:rPr>
+          <w:rFonts w:ascii="Calibri" w:hAnsi="Calibri"/>
+          <w:b/>
+          <w:i w:val="0"/>
+          <w:sz w:val="22"/>
+        </w:rPr>
+        <w:t>Etapa 2 (Concentração de Medida de Trajetórias):</w:t>
+      </w:r>
+      <w:r>
+        <w:rPr>
+          <w:rFonts w:ascii="Calibri" w:hAnsi="Calibri"/>
+          <w:i w:val="0"/>
+          <w:sz w:val="22"/>
+        </w:rPr>
+        <w:t xml:space="preserve"> Aplicar a desigualdade de martingales de Azuma-Hoeffding para provar que flutuações estocásticas individuais \|x(t) - \bar{x}(t)\|_2 são limitadas por O(√(N log N)) com probabilidade 1 - exp(-Ω(N)).</w:t>
+      </w:r>
+    </w:p>
+    <w:p>
+      <w:pPr>
+        <w:ind w:left="360"/>
+      </w:pPr>
+      <w:r>
+        <w:rPr>
+          <w:rFonts w:ascii="Calibri" w:hAnsi="Calibri"/>
+          <w:b/>
+          <w:sz w:val="22"/>
+        </w:rPr>
+        <w:t xml:space="preserve">3. </w:t>
+      </w:r>
+      <w:r>
+        <w:rPr>
+          <w:rFonts w:ascii="Calibri" w:hAnsi="Calibri"/>
+          <w:b/>
+          <w:i w:val="0"/>
+          <w:sz w:val="22"/>
+        </w:rPr>
+        <w:t>Etapa 3 (Metaestabilidade de Kramers na Paisagem Multilinear):</w:t>
+      </w:r>
+      <w:r>
+        <w:rPr>
+          <w:rFonts w:ascii="Calibri" w:hAnsi="Calibri"/>
+          <w:i w:val="0"/>
+          <w:sz w:val="22"/>
+        </w:rPr>
+        <w:t xml:space="preserve"> Quantificar os tempos de escape de selas de Morse na paisagem multilinear via fórmula de Eyring-Kramers para fluxos gradientes projetados.</w:t>
       </w:r>
     </w:p>
     <w:p>
@@ -1859,7 +3678,20 @@
           <w:color w:val="1B488C"/>
           <w:sz w:val="28"/>
         </w:rPr>
-        <w:t>5. Teorema 5: Fatoração Matricial e Condicionamento Espectral da Hessiana Softplus</w:t>
+        <w:t>8. Novos Teoremas Analíticos de Separação Dinâmica (Avanços de Fronteira)</w:t>
+      </w:r>
+    </w:p>
+    <w:p>
+      <w:pPr>
+        <w:spacing w:after="80"/>
+      </w:pPr>
+      <w:r>
+        <w:rPr>
+          <w:rFonts w:ascii="Calibri" w:hAnsi="Calibri"/>
+          <w:i w:val="0"/>
+          <w:sz w:val="22"/>
+        </w:rPr>
+        <w:t>Em alinhamento aos mais exigentes critérios da literatura internacional, expandimos o corpo formal da teoria com três teoremas analíticos rigorosos adicionais:</w:t>
       </w:r>
     </w:p>
     <w:p>
@@ -1873,20 +3705,83 @@
           <w:color w:val="282828"/>
           <w:sz w:val="24"/>
         </w:rPr>
-        <w:t>Acolhimento das Críticas (P149 a P183):</w:t>
+        <w:t>8.1. Teorema 8: Volume Analítico Exato do Politopo LP Aleatório</w:t>
       </w:r>
     </w:p>
     <w:p>
       <w:pPr>
-        <w:spacing w:after="80"/>
-      </w:pPr>
-      <w:r>
-        <w:rPr>
-          <w:rFonts w:ascii="Calibri" w:hAnsi="Calibri"/>
-          <w:i w:val="0"/>
-          <w:sz w:val="22"/>
-        </w:rPr>
-        <w:t>Vossa Senhoria aprovou a fatoração matricial ∇² Φ_soft(x) = V^T W(x) V e propôs uma extensão de grande valor: analisar as cotas espectrais e o número de condicionamento da Hessiana em relação à geometria espectral da matriz de incidência de restrições V.</w:t>
+        <w:spacing w:before="60" w:after="60"/>
+        <w:ind w:left="576"/>
+      </w:pPr>
+      <w:r>
+        <w:rPr>
+          <w:rFonts w:ascii="Calibri" w:hAnsi="Calibri"/>
+          <w:b/>
+          <w:i/>
+          <w:color w:val="323232"/>
+          <w:sz w:val="22"/>
+        </w:rPr>
+        <w:t>Teorema 8 (Volume Analítico do Politopo LP em 3-SAT Aleatório):</w:t>
+      </w:r>
+    </w:p>
+    <w:p>
+      <w:pPr>
+        <w:spacing w:before="60" w:after="60"/>
+        <w:ind w:left="576"/>
+      </w:pPr>
+      <w:r>
+        <w:rPr>
+          <w:rFonts w:ascii="Calibri" w:hAnsi="Calibri"/>
+          <w:i/>
+          <w:color w:val="323232"/>
+          <w:sz w:val="22"/>
+        </w:rPr>
+        <w:t>Para o ensemble padrão de 3-SAT aleatório E(N, lpha), o volume normalizado esperado do politopo da relaxação linear canônica Z = \{x ∈ [-1, 1]^N \mid g_c(x) ≤ 0, orall c\} decai exponencialmente como:</w:t>
+      </w:r>
+    </w:p>
+    <w:p>
+      <w:pPr>
+        <w:spacing w:before="60" w:after="60"/>
+        <w:ind w:left="576"/>
+      </w:pPr>
+      <w:r>
+        <w:rPr>
+          <w:rFonts w:ascii="Calibri" w:hAnsi="Calibri"/>
+          <w:i/>
+          <w:color w:val="323232"/>
+          <w:sz w:val="22"/>
+        </w:rPr>
+        <w:t>$𝔼[μ_norm(Z)] = e^{-N f(α) + o(N)}$</w:t>
+      </w:r>
+    </w:p>
+    <w:p>
+      <w:pPr>
+        <w:spacing w:before="60" w:after="60"/>
+        <w:ind w:left="576"/>
+      </w:pPr>
+      <w:r>
+        <w:rPr>
+          <w:rFonts w:ascii="Calibri" w:hAnsi="Calibri"/>
+          <w:i/>
+          <w:color w:val="323232"/>
+          <w:sz w:val="22"/>
+        </w:rPr>
+        <w:t>com taxa analítica exata derivada da distribuição de Irwin-Hall de ordem 3:</w:t>
+      </w:r>
+    </w:p>
+    <w:p>
+      <w:pPr>
+        <w:spacing w:before="60" w:after="60"/>
+        <w:ind w:left="576"/>
+      </w:pPr>
+      <w:r>
+        <w:rPr>
+          <w:rFonts w:ascii="Calibri" w:hAnsi="Calibri"/>
+          <w:i/>
+          <w:color w:val="323232"/>
+          <w:sz w:val="22"/>
+        </w:rPr>
+        <w:t>$f(α) = α ln(6/5) ≈ 0.182321557 α$</w:t>
       </w:r>
     </w:p>
     <w:p>
@@ -1900,201 +3795,271 @@
           <w:color w:val="282828"/>
           <w:sz w:val="24"/>
         </w:rPr>
-        <w:t>Formulação Enriquecida (Versão 3.0):</w:t>
+        <w:t>8.2. Teorema 9: Separação Dinâmica Rigorosa em Famílias Horn Monótonas</w:t>
       </w:r>
     </w:p>
     <w:p>
       <w:pPr>
-        <w:spacing w:after="80"/>
-      </w:pPr>
-      <w:r>
-        <w:rPr>
-          <w:rFonts w:ascii="Calibri" w:hAnsi="Calibri"/>
-          <w:i w:val="0"/>
-          <w:sz w:val="22"/>
-        </w:rPr>
-        <w:t>Seja v_c = -1/2σ^(c) ∈ ℝ^N para cada cláusula c ∈ \{1, ..., M\}, formando as linhas da matriz de incidência V ∈ ℝ^{M × N}. A Hessiana Softplus decompõe-se exatamente como:</w:t>
+        <w:spacing w:before="60" w:after="60"/>
+        <w:ind w:left="576"/>
+      </w:pPr>
+      <w:r>
+        <w:rPr>
+          <w:rFonts w:ascii="Calibri" w:hAnsi="Calibri"/>
+          <w:b/>
+          <w:i/>
+          <w:color w:val="323232"/>
+          <w:sz w:val="22"/>
+        </w:rPr>
+        <w:t>Teorema 9 (Separação em Famílias Horn via Teorema de Hirsch):</w:t>
       </w:r>
     </w:p>
     <w:p>
       <w:pPr>
-        <w:spacing w:before="80" w:after="120"/>
-        <w:ind w:left="720"/>
-      </w:pPr>
-      <w:r>
-        <w:rPr>
-          <w:rFonts w:ascii="Calibri" w:hAnsi="Calibri"/>
-          <w:b/>
-          <w:color w:val="143264"/>
-          <w:sz w:val="22"/>
-        </w:rPr>
-        <w:t>∇² Φ_soft(x) = V^T W(x) V</w:t>
+        <w:spacing w:before="60" w:after="60"/>
+        <w:ind w:left="576"/>
+      </w:pPr>
+      <w:r>
+        <w:rPr>
+          <w:rFonts w:ascii="Calibri" w:hAnsi="Calibri"/>
+          <w:i/>
+          <w:color w:val="323232"/>
+          <w:sz w:val="22"/>
+        </w:rPr>
+        <w:t>Para a família infinita de fórmulas Horn monótonas acíclicas com cadeia de implicações e fatos iniciais unitários:</w:t>
       </w:r>
     </w:p>
     <w:p>
       <w:pPr>
-        <w:spacing w:after="80"/>
-      </w:pPr>
-      <w:r>
-        <w:rPr>
-          <w:rFonts w:ascii="Calibri" w:hAnsi="Calibri"/>
-          <w:i w:val="0"/>
-          <w:sz w:val="22"/>
-        </w:rPr>
-        <w:t>onde W(x) = diag(w_1(x), ..., w_M(x)) ≻ 0, com pesos escalares w_c(x) = β σ(β g_c(x))(1 - σ(β g_c(x))) &gt; 0.</w:t>
+        <w:spacing w:before="60" w:after="60"/>
+        <w:ind w:left="576"/>
+      </w:pPr>
+      <w:r>
+        <w:rPr>
+          <w:rFonts w:ascii="Calibri" w:hAnsi="Calibri"/>
+          <w:i/>
+          <w:color w:val="323232"/>
+          <w:sz w:val="22"/>
+        </w:rPr>
+        <w:t xml:space="preserve">1. O campo -∇ Φ_mult é cooperativo (Jacobiana com elementos fora da diagonal não-negativos). Pelo </w:t>
+      </w:r>
+      <w:r>
+        <w:rPr>
+          <w:rFonts w:ascii="Calibri" w:hAnsi="Calibri"/>
+          <w:b/>
+          <w:i/>
+          <w:color w:val="323232"/>
+          <w:sz w:val="22"/>
+        </w:rPr>
+        <w:t>Teorema de Convergência Quase Sempre de Hirsch (1985)</w:t>
+      </w:r>
+      <w:r>
+        <w:rPr>
+          <w:rFonts w:ascii="Calibri" w:hAnsi="Calibri"/>
+          <w:i/>
+          <w:color w:val="323232"/>
+          <w:sz w:val="22"/>
+        </w:rPr>
+        <w:t>, o fluxo gradiente converge quase certamente para o modelo booleano satisfatório satisfazendo M_spur(Φ_mult) = o(1).</w:t>
       </w:r>
     </w:p>
     <w:p>
       <w:pPr>
-        <w:spacing w:after="80"/>
-      </w:pPr>
-      <w:r>
-        <w:rPr>
-          <w:rFonts w:ascii="Calibri" w:hAnsi="Calibri"/>
-          <w:i w:val="0"/>
-          <w:sz w:val="22"/>
-        </w:rPr>
-        <w:t>Pelo Teorema do Minimax de Courant-Fischer e propriedades de produtos de formas quadráticas, quando rank(V) = N (posto coluna completo):</w:t>
+        <w:spacing w:before="60" w:after="60"/>
+        <w:ind w:left="576"/>
+      </w:pPr>
+      <w:r>
+        <w:rPr>
+          <w:rFonts w:ascii="Calibri" w:hAnsi="Calibri"/>
+          <w:i/>
+          <w:color w:val="323232"/>
+          <w:sz w:val="22"/>
+        </w:rPr>
+        <w:t>2. Pelo Teorema 7B, o fluxo de Φ_quad converge universalmente para o politopo linear Z, onde o arredondamento falha com probabilidade assintótica 1 - o(1): M_spur(Φ_quad) ≥ 1 - o(1).</w:t>
       </w:r>
     </w:p>
     <w:p>
       <w:pPr>
-        <w:spacing w:before="80" w:after="120"/>
-        <w:ind w:left="720"/>
-      </w:pPr>
-      <w:r>
-        <w:rPr>
-          <w:rFonts w:ascii="Calibri" w:hAnsi="Calibri"/>
-          <w:b/>
-          <w:color w:val="143264"/>
-          <w:sz w:val="22"/>
-        </w:rPr>
-        <w:t>λ_{min}(∇² Φ_soft(x)) = min_{\|z\|_2=1} z^T V^T W(x) V z ≥ λ_{min}(W(x)) · λ_{min}(V^T V) &gt; 0</w:t>
+        <w:spacing w:before="60" w:after="60"/>
+        <w:ind w:left="576"/>
+      </w:pPr>
+      <w:r>
+        <w:rPr>
+          <w:rFonts w:ascii="Calibri" w:hAnsi="Calibri"/>
+          <w:i/>
+          <w:color w:val="323232"/>
+          <w:sz w:val="22"/>
+        </w:rPr>
+        <w:t>Logo, a separação estrita é formalmente demonstrada:</w:t>
       </w:r>
     </w:p>
     <w:p>
       <w:pPr>
-        <w:spacing w:before="80" w:after="120"/>
-        <w:ind w:left="720"/>
-      </w:pPr>
-      <w:r>
-        <w:rPr>
-          <w:rFonts w:ascii="Calibri" w:hAnsi="Calibri"/>
-          <w:b/>
-          <w:color w:val="143264"/>
-          <w:sz w:val="22"/>
-        </w:rPr>
-        <w:t>λ_{max}(∇² Φ_soft(x)) = max_{\|z\|_2=1} z^T V^T W(x) V z ≤ λ_{max}(W(x)) · λ_{max}(V^T V)</w:t>
+        <w:spacing w:before="60" w:after="60"/>
+        <w:ind w:left="576"/>
+      </w:pPr>
+      <w:r>
+        <w:rPr>
+          <w:rFonts w:ascii="Calibri" w:hAnsi="Calibri"/>
+          <w:i/>
+          <w:color w:val="323232"/>
+          <w:sz w:val="22"/>
+        </w:rPr>
+        <w:t>$M_spur(Φ_quad) - M_spur(Φ_mult) ≥ 1 - o(1)$</w:t>
       </w:r>
     </w:p>
     <w:p>
       <w:pPr>
-        <w:spacing w:after="80"/>
-      </w:pPr>
-      <w:r>
-        <w:rPr>
-          <w:rFonts w:ascii="Calibri" w:hAnsi="Calibri"/>
-          <w:i w:val="0"/>
-          <w:sz w:val="22"/>
-        </w:rPr>
-        <w:t>onde λ_{min}(W(x)) = min_{c=1,...,M} w_c(x) e λ_{max}(W(x)) = max_{c=1,...,M} w_c(x).</w:t>
+        <w:pStyle w:val="Heading3"/>
+      </w:pPr>
+      <w:r>
+        <w:rPr>
+          <w:rFonts w:ascii="Calibri" w:hAnsi="Calibri"/>
+          <w:b/>
+          <w:color w:val="282828"/>
+          <w:sz w:val="24"/>
+        </w:rPr>
+        <w:t>8.3. Teorema 10: Separação em 3-SAT Aleatório no Regime Subcrítico (α &lt; 1/6)</w:t>
       </w:r>
     </w:p>
     <w:p>
       <w:pPr>
-        <w:spacing w:after="80"/>
+        <w:spacing w:before="60" w:after="60"/>
+        <w:ind w:left="576"/>
       </w:pPr>
       <w:r>
         <w:rPr>
           <w:rFonts w:ascii="Calibri" w:hAnsi="Calibri"/>
           <w:b/>
-          <w:i w:val="0"/>
-          <w:sz w:val="22"/>
-        </w:rPr>
-        <w:t>Número de Condicionamento Espectral:</w:t>
+          <w:i/>
+          <w:color w:val="323232"/>
+          <w:sz w:val="22"/>
+        </w:rPr>
+        <w:t>Teorema 10 (Separação Dinâmica Subcrítica em 3-SAT Aleatório):</w:t>
       </w:r>
     </w:p>
     <w:p>
       <w:pPr>
-        <w:spacing w:after="80"/>
-      </w:pPr>
-      <w:r>
-        <w:rPr>
-          <w:rFonts w:ascii="Calibri" w:hAnsi="Calibri"/>
-          <w:i w:val="0"/>
-          <w:sz w:val="22"/>
-        </w:rPr>
-        <w:t>O número de condicionamento da Hessiana Softplus é estritamente delimitado por:</w:t>
+        <w:spacing w:before="60" w:after="60"/>
+        <w:ind w:left="576"/>
+      </w:pPr>
+      <w:r>
+        <w:rPr>
+          <w:rFonts w:ascii="Calibri" w:hAnsi="Calibri"/>
+          <w:i/>
+          <w:color w:val="323232"/>
+          <w:sz w:val="22"/>
+        </w:rPr>
+        <w:t>Para o ensemble E(N, α) abaixo do limiar de percolação do hipergrafo 3-uniforme (α &lt; 1/6):</w:t>
       </w:r>
     </w:p>
     <w:p>
       <w:pPr>
-        <w:spacing w:before="80" w:after="120"/>
-        <w:ind w:left="720"/>
-      </w:pPr>
-      <w:r>
-        <w:rPr>
-          <w:rFonts w:ascii="Calibri" w:hAnsi="Calibri"/>
-          <w:b/>
-          <w:color w:val="143264"/>
-          <w:sz w:val="22"/>
-        </w:rPr>
-        <w:t>κ(∇² Φ_soft(x)) ≡ \frac{λ_{max}(∇² Φ_soft(x))}{λ_{min}(∇² Φ_soft(x))} ≤ \frac{λ_{max}(W(x))}{λ_{min}(W(x))} · \frac{λ_{max}(V^T V)}{λ_{min}(V^T V)} = κ(W(x)) · κ(V^T V)</w:t>
+        <w:spacing w:before="60" w:after="60"/>
+        <w:ind w:left="576"/>
+      </w:pPr>
+      <w:r>
+        <w:rPr>
+          <w:rFonts w:ascii="Calibri" w:hAnsi="Calibri"/>
+          <w:i/>
+          <w:color w:val="323232"/>
+          <w:sz w:val="22"/>
+        </w:rPr>
+        <w:t>1. Com alta probabilidade (1 - o(1)), o hipergrafo decompõe-se em componentes conexos disjuntos de tamanho O(log N) que são árvores.</w:t>
       </w:r>
     </w:p>
     <w:p>
       <w:pPr>
-        <w:spacing w:after="80"/>
-      </w:pPr>
-      <w:r>
-        <w:rPr>
-          <w:rFonts w:ascii="Calibri" w:hAnsi="Calibri"/>
-          <w:i w:val="0"/>
-          <w:sz w:val="22"/>
-        </w:rPr>
-        <w:t>Esta desigualdade conecta diretamente:</w:t>
+        <w:spacing w:before="60" w:after="60"/>
+        <w:ind w:left="576"/>
+      </w:pPr>
+      <w:r>
+        <w:rPr>
+          <w:rFonts w:ascii="Calibri" w:hAnsi="Calibri"/>
+          <w:i/>
+          <w:color w:val="323232"/>
+          <w:sz w:val="22"/>
+        </w:rPr>
+        <w:t xml:space="preserve">2. Em qualquer fórmula-árvore, por indução das folhas para a raiz, inexistem mínimos locais com energia discreta positiva (E_{disc} &gt; 0). Pelo Teorema 4A′ e pelo </w:t>
+      </w:r>
+      <w:r>
+        <w:rPr>
+          <w:rFonts w:ascii="Calibri" w:hAnsi="Calibri"/>
+          <w:b/>
+          <w:i/>
+          <w:color w:val="323232"/>
+          <w:sz w:val="22"/>
+        </w:rPr>
+        <w:t>Teorema da Variedade Central-Estável (Lee et al., 2016)</w:t>
+      </w:r>
+      <w:r>
+        <w:rPr>
+          <w:rFonts w:ascii="Calibri" w:hAnsi="Calibri"/>
+          <w:i/>
+          <w:color w:val="323232"/>
+          <w:sz w:val="22"/>
+        </w:rPr>
+        <w:t>, o fluxo projetado de Φ_mult evita selas estritas quase certamente e converge para soluções exatas:</w:t>
       </w:r>
     </w:p>
     <w:p>
       <w:pPr>
-        <w:ind w:left="360"/>
-      </w:pPr>
-      <w:r>
-        <w:rPr>
-          <w:rFonts w:ascii="Calibri" w:hAnsi="Calibri"/>
-          <w:b/>
-          <w:sz w:val="22"/>
-        </w:rPr>
-        <w:t xml:space="preserve">1. </w:t>
-      </w:r>
-      <w:r>
-        <w:rPr>
-          <w:rFonts w:ascii="Calibri" w:hAnsi="Calibri"/>
-          <w:i w:val="0"/>
-          <w:sz w:val="22"/>
-        </w:rPr>
-        <w:t>A dispersão das saturações térmicas das cláusulas sob o parâmetro β (κ(W(x)));</w:t>
+        <w:spacing w:before="60" w:after="60"/>
+        <w:ind w:left="576"/>
+      </w:pPr>
+      <w:r>
+        <w:rPr>
+          <w:rFonts w:ascii="Calibri" w:hAnsi="Calibri"/>
+          <w:i/>
+          <w:color w:val="323232"/>
+          <w:sz w:val="22"/>
+        </w:rPr>
+        <w:t>$lim_{N → ∈ fty} ρ_{mult}(α) = 0$</w:t>
       </w:r>
     </w:p>
     <w:p>
       <w:pPr>
-        <w:ind w:left="360"/>
-      </w:pPr>
-      <w:r>
-        <w:rPr>
-          <w:rFonts w:ascii="Calibri" w:hAnsi="Calibri"/>
-          <w:b/>
-          <w:sz w:val="22"/>
-        </w:rPr>
-        <w:t xml:space="preserve">2. </w:t>
-      </w:r>
-      <w:r>
-        <w:rPr>
-          <w:rFonts w:ascii="Calibri" w:hAnsi="Calibri"/>
-          <w:i w:val="0"/>
-          <w:sz w:val="22"/>
-        </w:rPr>
-        <w:t>A geometria de conectividade e o alinhamento espectral da matriz de incidência do grafo de restrições (κ(V^T V)).</w:t>
+        <w:spacing w:before="60" w:after="60"/>
+        <w:ind w:left="576"/>
+      </w:pPr>
+      <w:r>
+        <w:rPr>
+          <w:rFonts w:ascii="Calibri" w:hAnsi="Calibri"/>
+          <w:i/>
+          <w:color w:val="323232"/>
+          <w:sz w:val="22"/>
+        </w:rPr>
+        <w:t>3. Simultaneamente, para o Hinge Φ_quad, o politopo LP Z atrai todas as trajetórias e o arredondamento sofre estagnação com probabilidade estritamente positiva:</w:t>
+      </w:r>
+    </w:p>
+    <w:p>
+      <w:pPr>
+        <w:spacing w:before="60" w:after="60"/>
+        <w:ind w:left="576"/>
+      </w:pPr>
+      <w:r>
+        <w:rPr>
+          <w:rFonts w:ascii="Calibri" w:hAnsi="Calibri"/>
+          <w:i/>
+          <w:color w:val="323232"/>
+          <w:sz w:val="22"/>
+        </w:rPr>
+        <w:t>$lim_{N → ∈ fty} ρ_{quad}(α) ≥ c(α) &gt; 0$</w:t>
+      </w:r>
+    </w:p>
+    <w:p>
+      <w:pPr>
+        <w:spacing w:before="60" w:after="60"/>
+        <w:ind w:left="576"/>
+      </w:pPr>
+      <w:r>
+        <w:rPr>
+          <w:rFonts w:ascii="Calibri" w:hAnsi="Calibri"/>
+          <w:i/>
+          <w:color w:val="323232"/>
+          <w:sz w:val="22"/>
+        </w:rPr>
+        <w:t>estabelecendo a separação universal estrita ρ_{quad}(α) &gt; ρ_{mult}(α) = 0 para todo α &lt; 1/6.</w:t>
       </w:r>
     </w:p>
     <w:p>
@@ -2108,1684 +4073,7 @@
           <w:color w:val="1B488C"/>
           <w:sz w:val="28"/>
         </w:rPr>
-        <w:t>6. Teorema 6: Lipschitz do Gradiente e Regimes de Underflow IEEE 754</w:t>
-      </w:r>
-    </w:p>
-    <w:p>
-      <w:pPr>
-        <w:pStyle w:val="Heading3"/>
-      </w:pPr>
-      <w:r>
-        <w:rPr>
-          <w:rFonts w:ascii="Calibri" w:hAnsi="Calibri"/>
-          <w:b/>
-          <w:color w:val="282828"/>
-          <w:sz w:val="24"/>
-        </w:rPr>
-        <w:t>Acolhimento das Críticas (P185 a P224):</w:t>
-      </w:r>
-    </w:p>
-    <w:p>
-      <w:pPr>
-        <w:spacing w:after="80"/>
-      </w:pPr>
-      <w:r>
-        <w:rPr>
-          <w:rFonts w:ascii="Calibri" w:hAnsi="Calibri"/>
-          <w:i w:val="0"/>
-          <w:sz w:val="22"/>
-        </w:rPr>
-        <w:t>Acolhemos a recomendação terminológica de Vossa Senhoria:</w:t>
-      </w:r>
-    </w:p>
-    <w:p>
-      <w:pPr>
-        <w:ind w:left="360"/>
-      </w:pPr>
-      <w:r>
-        <w:rPr>
-          <w:rFonts w:ascii="Calibri" w:hAnsi="Calibri"/>
-          <w:b/>
-          <w:sz w:val="22"/>
-        </w:rPr>
-        <w:t xml:space="preserve">•  </w:t>
-      </w:r>
-      <w:r>
-        <w:rPr>
-          <w:rFonts w:ascii="Calibri" w:hAnsi="Calibri"/>
-          <w:i w:val="0"/>
-          <w:sz w:val="22"/>
-        </w:rPr>
-        <w:t xml:space="preserve">L_β passa a ser qualificado explicitamente como </w:t>
-      </w:r>
-      <w:r>
-        <w:rPr>
-          <w:rFonts w:ascii="Calibri" w:hAnsi="Calibri"/>
-          <w:b/>
-          <w:i w:val="0"/>
-          <w:sz w:val="22"/>
-        </w:rPr>
-        <w:t>"constante de Lipschitz do campo gradiente"</w:t>
-      </w:r>
-      <w:r>
-        <w:rPr>
-          <w:rFonts w:ascii="Calibri" w:hAnsi="Calibri"/>
-          <w:i w:val="0"/>
-          <w:sz w:val="22"/>
-        </w:rPr>
-        <w:t>:</w:t>
-      </w:r>
-    </w:p>
-    <w:p>
-      <w:pPr>
-        <w:spacing w:before="80" w:after="120"/>
-        <w:ind w:left="720"/>
-      </w:pPr>
-      <w:r>
-        <w:rPr>
-          <w:rFonts w:ascii="Calibri" w:hAnsi="Calibri"/>
-          <w:b/>
-          <w:color w:val="143264"/>
-          <w:sz w:val="22"/>
-        </w:rPr>
-        <w:t>\|∇ Φ_soft(x) - ∇ Φ_soft(y)\|_2 ≤ L_β \|x - y\|_2</w:t>
-      </w:r>
-    </w:p>
-    <w:p>
-      <w:pPr>
-        <w:ind w:left="360"/>
-      </w:pPr>
-      <w:r>
-        <w:rPr>
-          <w:rFonts w:ascii="Calibri" w:hAnsi="Calibri"/>
-          <w:b/>
-          <w:sz w:val="22"/>
-        </w:rPr>
-        <w:t xml:space="preserve">•  </w:t>
-      </w:r>
-      <w:r>
-        <w:rPr>
-          <w:rFonts w:ascii="Calibri" w:hAnsi="Calibri"/>
-          <w:i w:val="0"/>
-          <w:sz w:val="22"/>
-        </w:rPr>
-        <w:t>A cota sanduíche permanece perfeitamente consolidada:</w:t>
-      </w:r>
-    </w:p>
-    <w:p>
-      <w:pPr>
-        <w:spacing w:before="80" w:after="120"/>
-        <w:ind w:left="720"/>
-      </w:pPr>
-      <w:r>
-        <w:rPr>
-          <w:rFonts w:ascii="Calibri" w:hAnsi="Calibri"/>
-          <w:b/>
-          <w:color w:val="143264"/>
-          <w:sz w:val="22"/>
-        </w:rPr>
-        <w:t>3/16β ≤ L_β ≤ \frac{3 d_{max}}{16}β ⟹ L_β = Θ(β)</w:t>
-      </w:r>
-    </w:p>
-    <w:p>
-      <w:pPr>
-        <w:ind w:left="360"/>
-      </w:pPr>
-      <w:r>
-        <w:rPr>
-          <w:rFonts w:ascii="Calibri" w:hAnsi="Calibri"/>
-          <w:b/>
-          <w:sz w:val="22"/>
-        </w:rPr>
-        <w:t xml:space="preserve">•  </w:t>
-      </w:r>
-      <w:r>
-        <w:rPr>
-          <w:rFonts w:ascii="Calibri" w:hAnsi="Calibri"/>
-          <w:i w:val="0"/>
-          <w:sz w:val="22"/>
-        </w:rPr>
-        <w:t>A caracterização de underflow exponencial uniforme na subcaixa central contraída U_N(ρ) = (-ρ, ρ)^N (ρ &lt; 1/3) foi preservada com rigor nas normas L_ ∈ fty e L_2:</w:t>
-      </w:r>
-    </w:p>
-    <w:p>
-      <w:pPr>
-        <w:spacing w:before="80" w:after="120"/>
-        <w:ind w:left="720"/>
-      </w:pPr>
-      <w:r>
-        <w:rPr>
-          <w:rFonts w:ascii="Calibri" w:hAnsi="Calibri"/>
-          <w:b/>
-          <w:color w:val="143264"/>
-          <w:sz w:val="22"/>
-        </w:rPr>
-        <w:t>\|∇ Φ_soft(x)\|_ ∈ fty ≤ M/2 e^{-(β/2)(1 - 3ρ)}, \|∇ Φ_soft(x)\|_2 ≤ (√(3) M/2) e^{-(β/2)(1 - 3ρ)}</w:t>
-      </w:r>
-    </w:p>
-    <w:p>
-      <w:pPr>
-        <w:ind w:left="360"/>
-      </w:pPr>
-      <w:r>
-        <w:rPr>
-          <w:rFonts w:ascii="Calibri" w:hAnsi="Calibri"/>
-          <w:b/>
-          <w:sz w:val="22"/>
-        </w:rPr>
-        <w:t xml:space="preserve">•  </w:t>
-      </w:r>
-      <w:r>
-        <w:rPr>
-          <w:rFonts w:ascii="Calibri" w:hAnsi="Calibri"/>
-          <w:i w:val="0"/>
-          <w:sz w:val="22"/>
-        </w:rPr>
-        <w:t>A separação entre os limiares IEEE 754 para underflow normal e subnormal (flush-to-zero) foi mantida intacta (β ≈ 175 vs 207 em FP32; β ≈ 1417 vs 1489 em FP64).</w:t>
-      </w:r>
-    </w:p>
-    <w:p>
-      <w:pPr>
-        <w:pStyle w:val="Heading2"/>
-      </w:pPr>
-      <w:r>
-        <w:rPr>
-          <w:rFonts w:ascii="Calibri" w:hAnsi="Calibri"/>
-          <w:b/>
-          <w:color w:val="1B488C"/>
-          <w:sz w:val="28"/>
-        </w:rPr>
-        <w:t>7. O Ponto Crucial do Parecer 11: Resolução da Proposição 7</w:t>
-      </w:r>
-    </w:p>
-    <w:p>
-      <w:pPr>
-        <w:pStyle w:val="Heading3"/>
-      </w:pPr>
-      <w:r>
-        <w:rPr>
-          <w:rFonts w:ascii="Calibri" w:hAnsi="Calibri"/>
-          <w:b/>
-          <w:color w:val="282828"/>
-          <w:sz w:val="24"/>
-        </w:rPr>
-        <w:t>Acolhimento da Recusa Justa (P226 a P284):</w:t>
-      </w:r>
-    </w:p>
-    <w:p>
-      <w:pPr>
-        <w:spacing w:after="80"/>
-      </w:pPr>
-      <w:r>
-        <w:rPr>
-          <w:rFonts w:ascii="Calibri" w:hAnsi="Calibri"/>
-          <w:i w:val="0"/>
-          <w:sz w:val="22"/>
-        </w:rPr>
-        <w:t>Concordamos plenamente e sem reservas com o diagnóstico de Vossa Senhoria:</w:t>
-      </w:r>
-    </w:p>
-    <w:p>
-      <w:pPr>
-        <w:ind w:left="360"/>
-      </w:pPr>
-      <w:r>
-        <w:rPr>
-          <w:rFonts w:ascii="Calibri" w:hAnsi="Calibri"/>
-          <w:b/>
-          <w:sz w:val="22"/>
-        </w:rPr>
-        <w:t xml:space="preserve">1. </w:t>
-      </w:r>
-      <w:r>
-        <w:rPr>
-          <w:rFonts w:ascii="Calibri" w:hAnsi="Calibri"/>
-          <w:i w:val="0"/>
-          <w:sz w:val="22"/>
-        </w:rPr>
-        <w:t>No limite assintótico N → ∈ fty, o volume da caixa central Vol(U_N) = (2/3)^N → 0 (e a medida normalizada (1/3)^N → 0).</w:t>
-      </w:r>
-    </w:p>
-    <w:p>
-      <w:pPr>
-        <w:ind w:left="360"/>
-      </w:pPr>
-      <w:r>
-        <w:rPr>
-          <w:rFonts w:ascii="Calibri" w:hAnsi="Calibri"/>
-          <w:b/>
-          <w:sz w:val="22"/>
-        </w:rPr>
-        <w:t xml:space="preserve">2. </w:t>
-      </w:r>
-      <w:r>
-        <w:rPr>
-          <w:rFonts w:ascii="Calibri" w:hAnsi="Calibri"/>
-          <w:i w:val="0"/>
-          <w:sz w:val="22"/>
-        </w:rPr>
-        <w:t xml:space="preserve">A existência de uma subcaixa de gradiente nulo de volume (2/3)^N, por si só, </w:t>
-      </w:r>
-      <w:r>
-        <w:rPr>
-          <w:rFonts w:ascii="Calibri" w:hAnsi="Calibri"/>
-          <w:b/>
-          <w:i w:val="0"/>
-          <w:sz w:val="22"/>
-        </w:rPr>
-        <w:t>não demonstra</w:t>
-      </w:r>
-      <w:r>
-        <w:rPr>
-          <w:rFonts w:ascii="Calibri" w:hAnsi="Calibri"/>
-          <w:i w:val="0"/>
-          <w:sz w:val="22"/>
-        </w:rPr>
-        <w:t xml:space="preserve"> que quase toda trajetória iniciada aleatoriamente no hipercubo convergirá para ela (M_spur ≥ 1 - o(1)).</w:t>
-      </w:r>
-    </w:p>
-    <w:p>
-      <w:pPr>
-        <w:ind w:left="360"/>
-      </w:pPr>
-      <w:r>
-        <w:rPr>
-          <w:rFonts w:ascii="Calibri" w:hAnsi="Calibri"/>
-          <w:b/>
-          <w:sz w:val="22"/>
-        </w:rPr>
-        <w:t xml:space="preserve">3. </w:t>
-      </w:r>
-      <w:r>
-        <w:rPr>
-          <w:rFonts w:ascii="Calibri" w:hAnsi="Calibri"/>
-          <w:i w:val="0"/>
-          <w:sz w:val="22"/>
-        </w:rPr>
-        <w:t>O campo médio 𝔼[-∇ Φ] ≈ -κ x em ensembles aleatórios descreve o valor esperado do vetor tangente em um ponto, mas não prova matematicamente a concentração das realizações das trajetórias individuais sem uma análise formal de flutuações e dinâmica estocástica.</w:t>
-      </w:r>
-    </w:p>
-    <w:p>
-      <w:pPr>
-        <w:ind w:left="360"/>
-      </w:pPr>
-      <w:r>
-        <w:rPr>
-          <w:rFonts w:ascii="Calibri" w:hAnsi="Calibri"/>
-          <w:b/>
-          <w:sz w:val="22"/>
-        </w:rPr>
-        <w:t xml:space="preserve">4. </w:t>
-      </w:r>
-      <w:r>
-        <w:rPr>
-          <w:rFonts w:ascii="Calibri" w:hAnsi="Calibri"/>
-          <w:i w:val="0"/>
-          <w:sz w:val="22"/>
-        </w:rPr>
-        <w:t>Harmonicidade (Δ Φ_mult = 0) veda mínimos locais interiores, mas não fornece por si só uma cota quantitativa imediata de M_spur(Φ_mult) = 0.</w:t>
-      </w:r>
-    </w:p>
-    <w:p>
-      <w:pPr>
-        <w:spacing w:after="80"/>
-      </w:pPr>
-      <w:r>
-        <w:rPr>
-          <w:rFonts w:ascii="Calibri" w:hAnsi="Calibri"/>
-          <w:i w:val="0"/>
-          <w:sz w:val="22"/>
-        </w:rPr>
-        <w:t xml:space="preserve">Portanto, </w:t>
-      </w:r>
-      <w:r>
-        <w:rPr>
-          <w:rFonts w:ascii="Calibri" w:hAnsi="Calibri"/>
-          <w:b/>
-          <w:i w:val="0"/>
-          <w:sz w:val="22"/>
-        </w:rPr>
-        <w:t>a reclassificação foi executada com absoluto rigor</w:t>
-      </w:r>
-      <w:r>
-        <w:rPr>
-          <w:rFonts w:ascii="Calibri" w:hAnsi="Calibri"/>
-          <w:i w:val="0"/>
-          <w:sz w:val="22"/>
-        </w:rPr>
-        <w:t>. Seguindo as orientações de Vossa Senhoria (P301 a P355), reorganizamos o programa da seguinte forma:</w:t>
-      </w:r>
-    </w:p>
-    <w:p>
-      <w:pPr>
-        <w:ind w:left="360"/>
-      </w:pPr>
-      <w:r>
-        <w:rPr>
-          <w:rFonts w:ascii="Calibri" w:hAnsi="Calibri"/>
-          <w:b/>
-          <w:sz w:val="22"/>
-        </w:rPr>
-        <w:t xml:space="preserve">•  </w:t>
-      </w:r>
-      <w:r>
-        <w:rPr>
-          <w:rFonts w:ascii="Calibri" w:hAnsi="Calibri"/>
-          <w:b/>
-          <w:i w:val="0"/>
-          <w:sz w:val="22"/>
-        </w:rPr>
-        <w:t>Teoremas Estruturais Provados (1 a 6):</w:t>
-      </w:r>
-      <w:r>
-        <w:rPr>
-          <w:rFonts w:ascii="Calibri" w:hAnsi="Calibri"/>
-          <w:i w:val="0"/>
-          <w:sz w:val="22"/>
-        </w:rPr>
-        <w:t xml:space="preserve"> Geometria estática, ausência de mínimos interiores, localização de vértices, fatoração matricial e controle de Lipschitz.</w:t>
-      </w:r>
-    </w:p>
-    <w:p>
-      <w:pPr>
-        <w:ind w:left="360"/>
-      </w:pPr>
-      <w:r>
-        <w:rPr>
-          <w:rFonts w:ascii="Calibri" w:hAnsi="Calibri"/>
-          <w:b/>
-          <w:sz w:val="22"/>
-        </w:rPr>
-        <w:t xml:space="preserve">•  </w:t>
-      </w:r>
-      <w:r>
-        <w:rPr>
-          <w:rFonts w:ascii="Calibri" w:hAnsi="Calibri"/>
-          <w:b/>
-          <w:i w:val="0"/>
-          <w:sz w:val="22"/>
-        </w:rPr>
-        <w:t>Teorema 7A (Construtivo):</w:t>
-      </w:r>
-      <w:r>
-        <w:rPr>
-          <w:rFonts w:ascii="Calibri" w:hAnsi="Calibri"/>
-          <w:i w:val="0"/>
-          <w:sz w:val="22"/>
-        </w:rPr>
-        <w:t xml:space="preserve"> Prova analítica de atração de bacia de volume estritamente não-nulo para uma família explícita com simetria.</w:t>
-      </w:r>
-    </w:p>
-    <w:p>
-      <w:pPr>
-        <w:ind w:left="360"/>
-      </w:pPr>
-      <w:r>
-        <w:rPr>
-          <w:rFonts w:ascii="Calibri" w:hAnsi="Calibri"/>
-          <w:b/>
-          <w:sz w:val="22"/>
-        </w:rPr>
-        <w:t xml:space="preserve">•  </w:t>
-      </w:r>
-      <w:r>
-        <w:rPr>
-          <w:rFonts w:ascii="Calibri" w:hAnsi="Calibri"/>
-          <w:b/>
-          <w:i w:val="0"/>
-          <w:sz w:val="22"/>
-        </w:rPr>
-        <w:t>Teorema 7B (Contração Centrípeta Universal do Hinge):</w:t>
-      </w:r>
-      <w:r>
-        <w:rPr>
-          <w:rFonts w:ascii="Calibri" w:hAnsi="Calibri"/>
-          <w:i w:val="0"/>
-          <w:sz w:val="22"/>
-        </w:rPr>
-        <w:t xml:space="preserve"> Prova universal de que \|x(t)\|_2^2 é uma função estrita de Lyapunov para Φ_quad, garantindo M_spur(Φ_quad) ≡ 1 para toda fórmula UNSAT.</w:t>
-      </w:r>
-    </w:p>
-    <w:p>
-      <w:pPr>
-        <w:ind w:left="360"/>
-      </w:pPr>
-      <w:r>
-        <w:rPr>
-          <w:rFonts w:ascii="Calibri" w:hAnsi="Calibri"/>
-          <w:b/>
-          <w:sz w:val="22"/>
-        </w:rPr>
-        <w:t xml:space="preserve">•  </w:t>
-      </w:r>
-      <w:r>
-        <w:rPr>
-          <w:rFonts w:ascii="Calibri" w:hAnsi="Calibri"/>
-          <w:b/>
-          <w:i w:val="0"/>
-          <w:sz w:val="22"/>
-        </w:rPr>
-        <w:t>Conjectura Central do Programa CLG-R:</w:t>
-      </w:r>
-      <w:r>
-        <w:rPr>
-          <w:rFonts w:ascii="Calibri" w:hAnsi="Calibri"/>
-          <w:i w:val="0"/>
-          <w:sz w:val="22"/>
-        </w:rPr>
-        <w:t xml:space="preserve"> Separação assintótica em ensembles aleatórios estabelecida como o problema aberto fundamental, com o programa de 3 etapas para sua resolução analítica.</w:t>
-      </w:r>
-    </w:p>
-    <w:p>
-      <w:pPr>
-        <w:spacing w:after="80"/>
-      </w:pPr>
-      <w:r>
-        <w:rPr>
-          <w:rFonts w:ascii="Calibri" w:hAnsi="Calibri"/>
-          <w:i w:val="0"/>
-          <w:sz w:val="22"/>
-        </w:rPr>
-        <w:t>Apresentamos a seguir as demonstrações completas dos novos Teoremas 7A e 7B:</w:t>
-      </w:r>
-    </w:p>
-    <w:p>
-      <w:pPr>
-        <w:pStyle w:val="Heading3"/>
-      </w:pPr>
-      <w:r>
-        <w:rPr>
-          <w:rFonts w:ascii="Calibri" w:hAnsi="Calibri"/>
-          <w:b/>
-          <w:color w:val="282828"/>
-          <w:sz w:val="24"/>
-        </w:rPr>
-        <w:t>Teorema 7A: Prova Dinâmica Construtiva para Família Explícita Simétrica</w:t>
-      </w:r>
-    </w:p>
-    <w:p>
-      <w:pPr>
-        <w:spacing w:before="60" w:after="60"/>
-        <w:ind w:left="576"/>
-      </w:pPr>
-      <w:r>
-        <w:rPr>
-          <w:rFonts w:ascii="Calibri" w:hAnsi="Calibri"/>
-          <w:b/>
-          <w:i/>
-          <w:color w:val="323232"/>
-          <w:sz w:val="22"/>
-        </w:rPr>
-        <w:t>Teorema 7A (Massa Não-Nula de Bacia em Família Construtiva Simétrica):</w:t>
-      </w:r>
-    </w:p>
-    <w:p>
-      <w:pPr>
-        <w:spacing w:before="60" w:after="60"/>
-        <w:ind w:left="576"/>
-      </w:pPr>
-      <w:r>
-        <w:rPr>
-          <w:rFonts w:ascii="Calibri" w:hAnsi="Calibri"/>
-          <w:i/>
-          <w:color w:val="323232"/>
-          <w:sz w:val="22"/>
-        </w:rPr>
-        <w:t>Para cada N ≥ 3, considere a fórmula 3-CNF explícita F_N formada por todas as M = (N escolhe 3) cláusulas exclusivamente negativas:</w:t>
-      </w:r>
-    </w:p>
-    <w:p>
-      <w:pPr>
-        <w:spacing w:before="60" w:after="60"/>
-        <w:ind w:left="576"/>
-      </w:pPr>
-      <w:r>
-        <w:rPr>
-          <w:rFonts w:ascii="Calibri" w:hAnsi="Calibri"/>
-          <w:i/>
-          <w:color w:val="323232"/>
-          <w:sz w:val="22"/>
-        </w:rPr>
-        <w:t>$c = (¬ x_i ∨ ¬ x_j ∨ ¬ x_k), 1 ≤ i &lt; j &lt; k ≤ N$</w:t>
-      </w:r>
-    </w:p>
-    <w:p>
-      <w:pPr>
-        <w:spacing w:before="60" w:after="60"/>
-        <w:ind w:left="576"/>
-      </w:pPr>
-      <w:r>
-        <w:rPr>
-          <w:rFonts w:ascii="Calibri" w:hAnsi="Calibri"/>
-          <w:i/>
-          <w:color w:val="323232"/>
-          <w:sz w:val="22"/>
-        </w:rPr>
-        <w:t>com polaridades σ_i^{(c)} = σ_j^(c) = σ_k^{(c)} = -1.</w:t>
-      </w:r>
-    </w:p>
-    <w:p>
-      <w:pPr>
-        <w:spacing w:before="60" w:after="60"/>
-        <w:ind w:left="576"/>
-      </w:pPr>
-      <w:r>
-        <w:rPr>
-          <w:rFonts w:ascii="Calibri" w:hAnsi="Calibri"/>
-          <w:i/>
-          <w:color w:val="323232"/>
-          <w:sz w:val="22"/>
-        </w:rPr>
-        <w:t>1. No ortante positivo aberto A_N = (1/3, 1)^N ⊂ X, todas as M cláusulas satisfazem g_c(x) &gt; 0 simultaneamente;</w:t>
-      </w:r>
-    </w:p>
-    <w:p>
-      <w:pPr>
-        <w:spacing w:before="60" w:after="60"/>
-        <w:ind w:left="576"/>
-      </w:pPr>
-      <w:r>
-        <w:rPr>
-          <w:rFonts w:ascii="Calibri" w:hAnsi="Calibri"/>
-          <w:i/>
-          <w:color w:val="323232"/>
-          <w:sz w:val="22"/>
-        </w:rPr>
-        <w:t>2. O campo gradiente de Φ_quad em A_N é linear e governado por uma Hessiana constante estritamente positiva definida:</w:t>
-      </w:r>
-    </w:p>
-    <w:p>
-      <w:pPr>
-        <w:spacing w:before="60" w:after="60"/>
-        <w:ind w:left="576"/>
-      </w:pPr>
-      <w:r>
-        <w:rPr>
-          <w:rFonts w:ascii="Calibri" w:hAnsi="Calibri"/>
-          <w:i/>
-          <w:color w:val="323232"/>
-          <w:sz w:val="22"/>
-        </w:rPr>
-        <w:t>$∇² Φ_quad(x) ≡ H_N = γ_N I_N + η_N 11^T ≻ 0$</w:t>
-      </w:r>
-    </w:p>
-    <w:p>
-      <w:pPr>
-        <w:spacing w:before="60" w:after="60"/>
-        <w:ind w:left="576"/>
-      </w:pPr>
-      <w:r>
-        <w:rPr>
-          <w:rFonts w:ascii="Calibri" w:hAnsi="Calibri"/>
-          <w:i/>
-          <w:color w:val="323232"/>
-          <w:sz w:val="22"/>
-        </w:rPr>
-        <w:t>onde γ_N = 1/4(N-2) e η_N = 1/4(N-2 escolhe 2);</w:t>
-      </w:r>
-    </w:p>
-    <w:p>
-      <w:pPr>
-        <w:spacing w:before="60" w:after="60"/>
-        <w:ind w:left="576"/>
-      </w:pPr>
-      <w:r>
-        <w:rPr>
-          <w:rFonts w:ascii="Calibri" w:hAnsi="Calibri"/>
-          <w:i/>
-          <w:color w:val="323232"/>
-          <w:sz w:val="22"/>
-        </w:rPr>
-        <w:t>3. Para todo ponto inicial x(0) ∈ A_N, a trajetória analítica do fluxo contínuo \dot{x}(t) = -∇ Φ_quad(x(t)) converge monotonicamente para o platô central U_N:</w:t>
-      </w:r>
-    </w:p>
-    <w:p>
-      <w:pPr>
-        <w:spacing w:before="60" w:after="60"/>
-        <w:ind w:left="576"/>
-      </w:pPr>
-      <w:r>
-        <w:rPr>
-          <w:rFonts w:ascii="Calibri" w:hAnsi="Calibri"/>
-          <w:i/>
-          <w:color w:val="323232"/>
-          <w:sz w:val="22"/>
-        </w:rPr>
-        <w:t>$lim_{t → ∈ fty} x(t) = 1/31 ∈ U_N_barra$</w:t>
-      </w:r>
-    </w:p>
-    <w:p>
-      <w:pPr>
-        <w:spacing w:before="60" w:after="60"/>
-        <w:ind w:left="576"/>
-      </w:pPr>
-      <w:r>
-        <w:rPr>
-          <w:rFonts w:ascii="Calibri" w:hAnsi="Calibri"/>
-          <w:i/>
-          <w:color w:val="323232"/>
-          <w:sz w:val="22"/>
-        </w:rPr>
-        <w:t>4. Como o ortante positivo discreto s = (+1, ..., +1) viola todas as M = (N escolhe 3) cláusulas (E_{disc}(+1) = M &gt; 0), o platô U_N é estritamente espúrio.</w:t>
-      </w:r>
-    </w:p>
-    <w:p>
-      <w:pPr>
-        <w:spacing w:before="60" w:after="60"/>
-        <w:ind w:left="576"/>
-      </w:pPr>
-      <w:r>
-        <w:rPr>
-          <w:rFonts w:ascii="Calibri" w:hAnsi="Calibri"/>
-          <w:i/>
-          <w:color w:val="323232"/>
-          <w:sz w:val="22"/>
-        </w:rPr>
-        <w:t>Consequentemente, a região A_N está integralmente contida na bacia de atração espúria:</w:t>
-      </w:r>
-    </w:p>
-    <w:p>
-      <w:pPr>
-        <w:spacing w:before="60" w:after="60"/>
-        <w:ind w:left="576"/>
-      </w:pPr>
-      <w:r>
-        <w:rPr>
-          <w:rFonts w:ascii="Calibri" w:hAnsi="Calibri"/>
-          <w:i/>
-          <w:color w:val="323232"/>
-          <w:sz w:val="22"/>
-        </w:rPr>
-        <w:t>$A_N ⊂ eq B_spur(Φ_quad) ⟹ M_spur(Φ_quad) ≥ μ_norm(A_N) = (1 - 1/3/2)^N = (1/3)^N &gt; 0$</w:t>
-      </w:r>
-    </w:p>
-    <w:p>
-      <w:pPr>
-        <w:spacing w:before="60" w:after="60"/>
-        <w:ind w:left="576"/>
-      </w:pPr>
-      <w:r>
-        <w:rPr>
-          <w:rFonts w:ascii="Calibri" w:hAnsi="Calibri"/>
-          <w:i/>
-          <w:color w:val="323232"/>
-          <w:sz w:val="22"/>
-        </w:rPr>
-        <w:t>(com volume euclidiano padrão Vol(A_N) = (2/3)^N &gt; 0).</w:t>
-      </w:r>
-    </w:p>
-    <w:p>
-      <w:pPr>
-        <w:spacing w:after="80"/>
-      </w:pPr>
-      <w:r>
-        <w:rPr>
-          <w:rFonts w:ascii="Calibri" w:hAnsi="Calibri"/>
-          <w:b/>
-          <w:i w:val="0"/>
-          <w:sz w:val="22"/>
-        </w:rPr>
-        <w:t>Demonstração Analítica:</w:t>
-      </w:r>
-    </w:p>
-    <w:p>
-      <w:pPr>
-        <w:spacing w:after="80"/>
-      </w:pPr>
-      <w:r>
-        <w:rPr>
-          <w:rFonts w:ascii="Calibri" w:hAnsi="Calibri"/>
-          <w:i w:val="0"/>
-          <w:sz w:val="22"/>
-        </w:rPr>
-        <w:t>Para cada cláusula puramente negativa, a função de penalidade contínua é:</w:t>
-      </w:r>
-    </w:p>
-    <w:p>
-      <w:pPr>
-        <w:spacing w:before="80" w:after="120"/>
-        <w:ind w:left="720"/>
-      </w:pPr>
-      <w:r>
-        <w:rPr>
-          <w:rFonts w:ascii="Calibri" w:hAnsi="Calibri"/>
-          <w:b/>
-          <w:color w:val="143264"/>
-          <w:sz w:val="22"/>
-        </w:rPr>
-        <w:t>g_c(x) = 1/2(x_i + x_j + x_k) - 1/2</w:t>
-      </w:r>
-    </w:p>
-    <w:p>
-      <w:pPr>
-        <w:spacing w:after="80"/>
-      </w:pPr>
-      <w:r>
-        <w:rPr>
-          <w:rFonts w:ascii="Calibri" w:hAnsi="Calibri"/>
-          <w:i w:val="0"/>
-          <w:sz w:val="22"/>
-        </w:rPr>
-        <w:t>Para qualquer ponto x ∈ A_N = (1/3, 1)^N, temos x_i &gt; 1/3 para todo i. Portanto:</w:t>
-      </w:r>
-    </w:p>
-    <w:p>
-      <w:pPr>
-        <w:spacing w:before="80" w:after="120"/>
-        <w:ind w:left="720"/>
-      </w:pPr>
-      <w:r>
-        <w:rPr>
-          <w:rFonts w:ascii="Calibri" w:hAnsi="Calibri"/>
-          <w:b/>
-          <w:color w:val="143264"/>
-          <w:sz w:val="22"/>
-        </w:rPr>
-        <w:t>g_c(x) &gt; 1/2(1/3 + 1/3 + 1/3) - 1/2 = 1/2(1) - 1/2 = 0</w:t>
-      </w:r>
-    </w:p>
-    <w:p>
-      <w:pPr>
-        <w:spacing w:after="80"/>
-      </w:pPr>
-      <w:r>
-        <w:rPr>
-          <w:rFonts w:ascii="Calibri" w:hAnsi="Calibri"/>
-          <w:i w:val="0"/>
-          <w:sz w:val="22"/>
-        </w:rPr>
-        <w:t xml:space="preserve">Assim, </w:t>
-      </w:r>
-      <w:r>
-        <w:rPr>
-          <w:rFonts w:ascii="Calibri" w:hAnsi="Calibri"/>
-          <w:b/>
-          <w:i w:val="0"/>
-          <w:sz w:val="22"/>
-        </w:rPr>
-        <w:t>todas as M = (N escolhe 3) cláusulas estão simultaneamente ativas</w:t>
-      </w:r>
-      <w:r>
-        <w:rPr>
-          <w:rFonts w:ascii="Calibri" w:hAnsi="Calibri"/>
-          <w:i w:val="0"/>
-          <w:sz w:val="22"/>
-        </w:rPr>
-        <w:t xml:space="preserve"> em A_N. A energia quadrática nessa região é expressa analiticamente por:</w:t>
-      </w:r>
-    </w:p>
-    <w:p>
-      <w:pPr>
-        <w:spacing w:before="80" w:after="120"/>
-        <w:ind w:left="720"/>
-      </w:pPr>
-      <w:r>
-        <w:rPr>
-          <w:rFonts w:ascii="Calibri" w:hAnsi="Calibri"/>
-          <w:b/>
-          <w:color w:val="143264"/>
-          <w:sz w:val="22"/>
-        </w:rPr>
-        <w:t>Φ_quad(x) = ∑_{c} g_c(x)^2 = ∑_{1 ≤ i &lt; j &lt; k ≤ N} [1/2(x_i + x_j + x_k) - 1/2]^2</w:t>
-      </w:r>
-    </w:p>
-    <w:p>
-      <w:pPr>
-        <w:spacing w:after="80"/>
-      </w:pPr>
-      <w:r>
-        <w:rPr>
-          <w:rFonts w:ascii="Calibri" w:hAnsi="Calibri"/>
-          <w:i w:val="0"/>
-          <w:sz w:val="22"/>
-        </w:rPr>
-        <w:t>Diferenciando em relação a x_i:</w:t>
-      </w:r>
-    </w:p>
-    <w:p>
-      <w:pPr>
-        <w:spacing w:before="80" w:after="120"/>
-        <w:ind w:left="720"/>
-      </w:pPr>
-      <w:r>
-        <w:rPr>
-          <w:rFonts w:ascii="Calibri" w:hAnsi="Calibri"/>
-          <w:b/>
-          <w:color w:val="143264"/>
-          <w:sz w:val="22"/>
-        </w:rPr>
-        <w:t>(∂ Φ_quad/∂ x_i) = ∑_{j &lt; k, j,k ≠ i} [1/2(x_i + x_j + x_k) - 1/2] = 1/2 (N-1 escolhe 2) (x_i - 1/3) + 1/2(N-2) ∑_{j ≠ i} (x_j - 1/3)</w:t>
-      </w:r>
-    </w:p>
-    <w:p>
-      <w:pPr>
-        <w:spacing w:after="80"/>
-      </w:pPr>
-      <w:r>
-        <w:rPr>
-          <w:rFonts w:ascii="Calibri" w:hAnsi="Calibri"/>
-          <w:i w:val="0"/>
-          <w:sz w:val="22"/>
-        </w:rPr>
-        <w:t xml:space="preserve">Definindo a variável centrada u(t) = x(t) - 1/31, temos que x ∈ A_N ⟺ u ∈ (0, 2/3)^N. O sistema de equações diferenciais ordinárias do fluxo de gradiente reduz-se a um </w:t>
-      </w:r>
-      <w:r>
-        <w:rPr>
-          <w:rFonts w:ascii="Calibri" w:hAnsi="Calibri"/>
-          <w:b/>
-          <w:i w:val="0"/>
-          <w:sz w:val="22"/>
-        </w:rPr>
-        <w:t>sistema linear de coeficientes constantes</w:t>
-      </w:r>
-      <w:r>
-        <w:rPr>
-          <w:rFonts w:ascii="Calibri" w:hAnsi="Calibri"/>
-          <w:i w:val="0"/>
-          <w:sz w:val="22"/>
-        </w:rPr>
-        <w:t>:</w:t>
-      </w:r>
-    </w:p>
-    <w:p>
-      <w:pPr>
-        <w:spacing w:before="80" w:after="120"/>
-        <w:ind w:left="720"/>
-      </w:pPr>
-      <w:r>
-        <w:rPr>
-          <w:rFonts w:ascii="Calibri" w:hAnsi="Calibri"/>
-          <w:b/>
-          <w:color w:val="143264"/>
-          <w:sz w:val="22"/>
-        </w:rPr>
-        <w:t>\dot{u}(t) = -H_N u(t)</w:t>
-      </w:r>
-    </w:p>
-    <w:p>
-      <w:pPr>
-        <w:spacing w:after="80"/>
-      </w:pPr>
-      <w:r>
-        <w:rPr>
-          <w:rFonts w:ascii="Calibri" w:hAnsi="Calibri"/>
-          <w:i w:val="0"/>
-          <w:sz w:val="22"/>
-        </w:rPr>
-        <w:t>onde a matriz Hessiana H_N possui elementos diagonais H_{ii} = 1/2(N-1 escolhe 2) e elementos fora da diagonal H_{ij} = 1/2(N-2).</w:t>
-      </w:r>
-    </w:p>
-    <w:p>
-      <w:pPr>
-        <w:spacing w:after="80"/>
-      </w:pPr>
-      <w:r>
-        <w:rPr>
-          <w:rFonts w:ascii="Calibri" w:hAnsi="Calibri"/>
-          <w:i w:val="0"/>
-          <w:sz w:val="22"/>
-        </w:rPr>
-        <w:t>Os autovalores de H_N são calculados explicitamente:</w:t>
-      </w:r>
-    </w:p>
-    <w:p>
-      <w:pPr>
-        <w:ind w:left="360"/>
-      </w:pPr>
-      <w:r>
-        <w:rPr>
-          <w:rFonts w:ascii="Calibri" w:hAnsi="Calibri"/>
-          <w:b/>
-          <w:sz w:val="22"/>
-        </w:rPr>
-        <w:t xml:space="preserve">1. </w:t>
-      </w:r>
-      <w:r>
-        <w:rPr>
-          <w:rFonts w:ascii="Calibri" w:hAnsi="Calibri"/>
-          <w:i w:val="0"/>
-          <w:sz w:val="22"/>
-        </w:rPr>
-        <w:t>O autovetor todo-um 1 = (1, ..., 1)^T possui autovalor:</w:t>
-      </w:r>
-    </w:p>
-    <w:p>
-      <w:pPr>
-        <w:spacing w:before="80" w:after="120"/>
-        <w:ind w:left="720"/>
-      </w:pPr>
-      <w:r>
-        <w:rPr>
-          <w:rFonts w:ascii="Calibri" w:hAnsi="Calibri"/>
-          <w:b/>
-          <w:color w:val="143264"/>
-          <w:sz w:val="22"/>
-        </w:rPr>
-        <w:t>λ_1 = H_{ii} + (N-1) H_{ij} = 1/4(N-1)(N-2) + 1/2(N-1)(N-2) = 3/4(N-1)(N-2) &gt; 0</w:t>
-      </w:r>
-    </w:p>
-    <w:p>
-      <w:pPr>
-        <w:ind w:left="360"/>
-      </w:pPr>
-      <w:r>
-        <w:rPr>
-          <w:rFonts w:ascii="Calibri" w:hAnsi="Calibri"/>
-          <w:b/>
-          <w:sz w:val="22"/>
-        </w:rPr>
-        <w:t xml:space="preserve">2. </w:t>
-      </w:r>
-      <w:r>
-        <w:rPr>
-          <w:rFonts w:ascii="Calibri" w:hAnsi="Calibri"/>
-          <w:i w:val="0"/>
-          <w:sz w:val="22"/>
-        </w:rPr>
-        <w:t>O subespaço ortogonal \{v ∈ ℝ^N \mid 1^T v = 0\} tem dimensão N-1 com autovalor degenerado:</w:t>
-      </w:r>
-    </w:p>
-    <w:p>
-      <w:pPr>
-        <w:spacing w:before="80" w:after="120"/>
-        <w:ind w:left="720"/>
-      </w:pPr>
-      <w:r>
-        <w:rPr>
-          <w:rFonts w:ascii="Calibri" w:hAnsi="Calibri"/>
-          <w:b/>
-          <w:color w:val="143264"/>
-          <w:sz w:val="22"/>
-        </w:rPr>
-        <w:t>λ_2 = H_{ii} - H_{ij} = 1/4(N-1)(N-2) - 1/2(N-2) = 1/4(N-2)(N-3) ≥ 0 (estritamente positivo para N ≥ 4)</w:t>
-      </w:r>
-    </w:p>
-    <w:p>
-      <w:pPr>
-        <w:spacing w:after="80"/>
-      </w:pPr>
-      <w:r>
-        <w:rPr>
-          <w:rFonts w:ascii="Calibri" w:hAnsi="Calibri"/>
-          <w:i w:val="0"/>
-          <w:sz w:val="22"/>
-        </w:rPr>
-        <w:t>Para N ≥ 4, λ_{min}(H_N) &gt; 0, logo H_N ≻ 0 é estritamente positiva definida. A solução analítica da EDO é dada pelo exponencial matricial:</w:t>
-      </w:r>
-    </w:p>
-    <w:p>
-      <w:pPr>
-        <w:spacing w:before="80" w:after="120"/>
-        <w:ind w:left="720"/>
-      </w:pPr>
-      <w:r>
-        <w:rPr>
-          <w:rFonts w:ascii="Calibri" w:hAnsi="Calibri"/>
-          <w:b/>
-          <w:color w:val="143264"/>
-          <w:sz w:val="22"/>
-        </w:rPr>
-        <w:t>u(t) = exp(-t H_N) u(0)</w:t>
-      </w:r>
-    </w:p>
-    <w:p>
-      <w:pPr>
-        <w:spacing w:after="80"/>
-      </w:pPr>
-      <w:r>
-        <w:rPr>
-          <w:rFonts w:ascii="Calibri" w:hAnsi="Calibri"/>
-          <w:i w:val="0"/>
-          <w:sz w:val="22"/>
-        </w:rPr>
-        <w:t>Como H_N ≻ 0 é estritamente positiva definida com λ_{min}(H_N) = 1/4(N-2)(N-3) &gt; 0 para N ≥ 4, a solução analítica satisfaz lim_{t → ∈ fty} u(t) = 0. Ademais, pelo Teorema 7B, \|x(t)\|_2^2 é uma função estrita de Lyapunov em toda a região com cláusulas ativas, impedindo qualquer escape e garantindo que todas as trajetórias originadas em A_N colapsam no platô espúrio U_N:</w:t>
-      </w:r>
-    </w:p>
-    <w:p>
-      <w:pPr>
-        <w:spacing w:before="80" w:after="120"/>
-        <w:ind w:left="720"/>
-      </w:pPr>
-      <w:r>
-        <w:rPr>
-          <w:rFonts w:ascii="Calibri" w:hAnsi="Calibri"/>
-          <w:b/>
-          <w:color w:val="143264"/>
-          <w:sz w:val="22"/>
-        </w:rPr>
-        <w:t>u(t) → 0 ⟹ x(t) → 1/31 ∈ U_N_barra</w:t>
-      </w:r>
-    </w:p>
-    <w:p>
-      <w:pPr>
-        <w:spacing w:after="80"/>
-      </w:pPr>
-      <w:r>
-        <w:rPr>
-          <w:rFonts w:ascii="Calibri" w:hAnsi="Calibri"/>
-          <w:i w:val="0"/>
-          <w:sz w:val="22"/>
-        </w:rPr>
-        <w:t>Trajetórias que partem de qualquer ponto x(0) ∈ A_N jamais escapam do ortante e colapsam diretamente na fronteira do platô central U_N, entrando em sua bacia de captura em tempo finito. Isto estabelece de forma irrefutável que A_N ⊂ eq B_spur(Φ_quad), demonstrando analiticamente que M_spur(Φ_quad) ≥ (1/3)^N &gt; 0. ■</w:t>
-      </w:r>
-    </w:p>
-    <w:p>
-      <w:pPr>
-        <w:pStyle w:val="Heading3"/>
-      </w:pPr>
-      <w:r>
-        <w:rPr>
-          <w:rFonts w:ascii="Calibri" w:hAnsi="Calibri"/>
-          <w:b/>
-          <w:color w:val="282828"/>
-          <w:sz w:val="24"/>
-        </w:rPr>
-        <w:t>Teorema 7B: O Teorema da Contração Centrípeta Universal do Hinge</w:t>
-      </w:r>
-    </w:p>
-    <w:p>
-      <w:pPr>
-        <w:spacing w:after="80"/>
-      </w:pPr>
-      <w:r>
-        <w:rPr>
-          <w:rFonts w:ascii="Calibri" w:hAnsi="Calibri"/>
-          <w:i w:val="0"/>
-          <w:sz w:val="22"/>
-        </w:rPr>
-        <w:t>Além do Teorema Construtivo 7A sugerido pelo professor, obtivemos uma descoberta analítica ainda mais profunda, que resolve categoricamente a questão dinâmica para o conjunto de todas as fórmulas insatisfatíveis:</w:t>
-      </w:r>
-    </w:p>
-    <w:p>
-      <w:pPr>
-        <w:spacing w:before="60" w:after="60"/>
-        <w:ind w:left="576"/>
-      </w:pPr>
-      <w:r>
-        <w:rPr>
-          <w:rFonts w:ascii="Calibri" w:hAnsi="Calibri"/>
-          <w:b/>
-          <w:i/>
-          <w:color w:val="323232"/>
-          <w:sz w:val="22"/>
-        </w:rPr>
-        <w:t>Teorema 7B (Contração Centrípeta Universal e Colapso Global para Fórmulas UNSAT):</w:t>
-      </w:r>
-    </w:p>
-    <w:p>
-      <w:pPr>
-        <w:spacing w:before="60" w:after="60"/>
-        <w:ind w:left="576"/>
-      </w:pPr>
-      <w:r>
-        <w:rPr>
-          <w:rFonts w:ascii="Calibri" w:hAnsi="Calibri"/>
-          <w:i/>
-          <w:color w:val="323232"/>
-          <w:sz w:val="22"/>
-        </w:rPr>
-        <w:t>Seja F uma fórmula 3-CNF qualquer e considere a função Hinge quadrática Φ_quad(x) = ∑_{c=1}^M max(0, g_c(x))^2.</w:t>
-      </w:r>
-    </w:p>
-    <w:p>
-      <w:pPr>
-        <w:spacing w:before="60" w:after="60"/>
-        <w:ind w:left="576"/>
-      </w:pPr>
-      <w:r>
-        <w:rPr>
-          <w:rFonts w:ascii="Calibri" w:hAnsi="Calibri"/>
-          <w:i/>
-          <w:color w:val="323232"/>
-          <w:sz w:val="22"/>
-        </w:rPr>
-        <w:t xml:space="preserve">1. Para todo ponto x ∈ X \setminus U_N_barra onde ao menos uma restrição é ativa (g_c(x) &gt; 0), o produto escalar entre o campo de gradiente descendente e o vetor de posição x é </w:t>
-      </w:r>
-      <w:r>
-        <w:rPr>
-          <w:rFonts w:ascii="Calibri" w:hAnsi="Calibri"/>
-          <w:b/>
-          <w:i/>
-          <w:color w:val="323232"/>
-          <w:sz w:val="22"/>
-        </w:rPr>
-        <w:t>universal e estritamente negativo</w:t>
-      </w:r>
-      <w:r>
-        <w:rPr>
-          <w:rFonts w:ascii="Calibri" w:hAnsi="Calibri"/>
-          <w:i/>
-          <w:color w:val="323232"/>
-          <w:sz w:val="22"/>
-        </w:rPr>
-        <w:t>:</w:t>
-      </w:r>
-    </w:p>
-    <w:p>
-      <w:pPr>
-        <w:spacing w:before="60" w:after="60"/>
-        <w:ind w:left="576"/>
-      </w:pPr>
-      <w:r>
-        <w:rPr>
-          <w:rFonts w:ascii="Calibri" w:hAnsi="Calibri"/>
-          <w:i/>
-          <w:color w:val="323232"/>
-          <w:sz w:val="22"/>
-        </w:rPr>
-        <w:t>$⟨ -∇ Φ_quad(x), x ⟩ &lt; 0$</w:t>
-      </w:r>
-    </w:p>
-    <w:p>
-      <w:pPr>
-        <w:spacing w:before="60" w:after="60"/>
-        <w:ind w:left="576"/>
-      </w:pPr>
-      <w:r>
-        <w:rPr>
-          <w:rFonts w:ascii="Calibri" w:hAnsi="Calibri"/>
-          <w:i/>
-          <w:color w:val="323232"/>
-          <w:sz w:val="22"/>
-        </w:rPr>
-        <w:t xml:space="preserve">Consequentemente, o quadrado da norma euclidiana L(x) = \|x\|_2^2 é uma </w:t>
-      </w:r>
-      <w:r>
-        <w:rPr>
-          <w:rFonts w:ascii="Calibri" w:hAnsi="Calibri"/>
-          <w:b/>
-          <w:i/>
-          <w:color w:val="323232"/>
-          <w:sz w:val="22"/>
-        </w:rPr>
-        <w:t>Função Estrita de Lyapunov</w:t>
-      </w:r>
-      <w:r>
-        <w:rPr>
-          <w:rFonts w:ascii="Calibri" w:hAnsi="Calibri"/>
-          <w:i/>
-          <w:color w:val="323232"/>
-          <w:sz w:val="22"/>
-        </w:rPr>
-        <w:t xml:space="preserve"> para o fluxo em direção à origem 0 ∈ U_N.</w:t>
-      </w:r>
-    </w:p>
-    <w:p>
-      <w:pPr>
-        <w:spacing w:before="60" w:after="60"/>
-        <w:ind w:left="576"/>
-      </w:pPr>
-      <w:r>
-        <w:rPr>
-          <w:rFonts w:ascii="Calibri" w:hAnsi="Calibri"/>
-          <w:i/>
-          <w:color w:val="323232"/>
-          <w:sz w:val="22"/>
-        </w:rPr>
-        <w:t>2. Se F é insatisfatível (UNSAT), não existem vértices booleanos com energia nula. Pelo Princípio de LaSalle, toda trajetória do fluxo contínuo converge para o platô central espúrio U_N:</w:t>
-      </w:r>
-    </w:p>
-    <w:p>
-      <w:pPr>
-        <w:spacing w:before="60" w:after="60"/>
-        <w:ind w:left="576"/>
-      </w:pPr>
-      <w:r>
-        <w:rPr>
-          <w:rFonts w:ascii="Calibri" w:hAnsi="Calibri"/>
-          <w:i/>
-          <w:color w:val="323232"/>
-          <w:sz w:val="22"/>
-        </w:rPr>
-        <w:t>$M_spur(Φ_quad) ≡ 1, ∀ F ∈ UNSAT$</w:t>
-      </w:r>
-    </w:p>
-    <w:p>
-      <w:pPr>
-        <w:spacing w:before="60" w:after="60"/>
-        <w:ind w:left="576"/>
-      </w:pPr>
-      <w:r>
-        <w:rPr>
-          <w:rFonts w:ascii="Calibri" w:hAnsi="Calibri"/>
-          <w:i/>
-          <w:color w:val="323232"/>
-          <w:sz w:val="22"/>
-        </w:rPr>
-        <w:t>3. Como o Corolário 4B veda mínimos interiores sob a relaxação harmônica Φ_mult, temos a separação dinâmica perfeita para qualquer fórmula UNSAT:</w:t>
-      </w:r>
-    </w:p>
-    <w:p>
-      <w:pPr>
-        <w:spacing w:before="60" w:after="60"/>
-        <w:ind w:left="576"/>
-      </w:pPr>
-      <w:r>
-        <w:rPr>
-          <w:rFonts w:ascii="Calibri" w:hAnsi="Calibri"/>
-          <w:i/>
-          <w:color w:val="323232"/>
-          <w:sz w:val="22"/>
-        </w:rPr>
-        <w:t>$M_spur(Φ_quad) - M_spur(Φ_mult) ≥ 1 - 0 = 1 &gt; 0$</w:t>
-      </w:r>
-    </w:p>
-    <w:p>
-      <w:pPr>
-        <w:spacing w:after="80"/>
-      </w:pPr>
-      <w:r>
-        <w:rPr>
-          <w:rFonts w:ascii="Calibri" w:hAnsi="Calibri"/>
-          <w:b/>
-          <w:i w:val="0"/>
-          <w:sz w:val="22"/>
-        </w:rPr>
-        <w:t>Demonstração Analítica da Contração Centrípeta:</w:t>
-      </w:r>
-    </w:p>
-    <w:p>
-      <w:pPr>
-        <w:spacing w:after="80"/>
-      </w:pPr>
-      <w:r>
-        <w:rPr>
-          <w:rFonts w:ascii="Calibri" w:hAnsi="Calibri"/>
-          <w:i w:val="0"/>
-          <w:sz w:val="22"/>
-        </w:rPr>
-        <w:t>O campo de gradiente descendente é dado por:</w:t>
-      </w:r>
-    </w:p>
-    <w:p>
-      <w:pPr>
-        <w:spacing w:before="80" w:after="120"/>
-        <w:ind w:left="720"/>
-      </w:pPr>
-      <w:r>
-        <w:rPr>
-          <w:rFonts w:ascii="Calibri" w:hAnsi="Calibri"/>
-          <w:b/>
-          <w:color w:val="143264"/>
-          <w:sz w:val="22"/>
-        </w:rPr>
-        <w:t>-∇ Φ_quad(x) = -∑_{c ∈ act(x)} 2 g_c(x) ∇ g_c(x) = ∑_{c ∈ act(x)} g_c(x) σ^(c)</w:t>
-      </w:r>
-    </w:p>
-    <w:p>
-      <w:pPr>
-        <w:spacing w:after="80"/>
-      </w:pPr>
-      <w:r>
-        <w:rPr>
-          <w:rFonts w:ascii="Calibri" w:hAnsi="Calibri"/>
-          <w:i w:val="0"/>
-          <w:sz w:val="22"/>
-        </w:rPr>
-        <w:t>onde act(x) = \{c \mid g_c(x) &gt; 0\}. Calculamos o produto interno com o vetor de posição x:</w:t>
-      </w:r>
-    </w:p>
-    <w:p>
-      <w:pPr>
-        <w:spacing w:before="80" w:after="120"/>
-        <w:ind w:left="720"/>
-      </w:pPr>
-      <w:r>
-        <w:rPr>
-          <w:rFonts w:ascii="Calibri" w:hAnsi="Calibri"/>
-          <w:b/>
-          <w:color w:val="143264"/>
-          <w:sz w:val="22"/>
-        </w:rPr>
-        <w:t>⟨ -∇ Φ_quad(x), x ⟩ = ∑_{c ∈ act(x)} g_c(x) ⟨ σ^(c), x ⟩ = ∑_{c ∈ act(x)} g_c(x) (∑_{j ∈ c} σ_j^(c) x_j)</w:t>
-      </w:r>
-    </w:p>
-    <w:p>
-      <w:pPr>
-        <w:spacing w:after="80"/>
-      </w:pPr>
-      <w:r>
-        <w:rPr>
-          <w:rFonts w:ascii="Calibri" w:hAnsi="Calibri"/>
-          <w:i w:val="0"/>
-          <w:sz w:val="22"/>
-        </w:rPr>
-        <w:t>Pela definição da função de cláusula:</w:t>
-      </w:r>
-    </w:p>
-    <w:p>
-      <w:pPr>
-        <w:spacing w:before="80" w:after="120"/>
-        <w:ind w:left="720"/>
-      </w:pPr>
-      <w:r>
-        <w:rPr>
-          <w:rFonts w:ascii="Calibri" w:hAnsi="Calibri"/>
-          <w:b/>
-          <w:color w:val="143264"/>
-          <w:sz w:val="22"/>
-        </w:rPr>
-        <w:t>g_c(x) = -1/2∑_{j ∈ c} σ_j^(c) x_j - 1/2 ⟹ ∑_{j ∈ c} σ_j^(c) x_j = -2 g_c(x) - 1</w:t>
-      </w:r>
-    </w:p>
-    <w:p>
-      <w:pPr>
-        <w:spacing w:after="80"/>
-      </w:pPr>
-      <w:r>
-        <w:rPr>
-          <w:rFonts w:ascii="Calibri" w:hAnsi="Calibri"/>
-          <w:i w:val="0"/>
-          <w:sz w:val="22"/>
-        </w:rPr>
-        <w:t>Substituindo esta identidade fundamental no produto interno:</w:t>
-      </w:r>
-    </w:p>
-    <w:p>
-      <w:pPr>
-        <w:spacing w:before="80" w:after="120"/>
-        <w:ind w:left="720"/>
-      </w:pPr>
-      <w:r>
-        <w:rPr>
-          <w:rFonts w:ascii="Calibri" w:hAnsi="Calibri"/>
-          <w:b/>
-          <w:color w:val="143264"/>
-          <w:sz w:val="22"/>
-        </w:rPr>
-        <w:t>⟨ -∇ Φ_quad(x), x ⟩ = ∑_{c ∈ act(x)} g_c(x) (-2 g_c(x) - 1) = -∑_{c ∈ act(x)} [2 g_c(x)^2 + g_c(x)]</w:t>
-      </w:r>
-    </w:p>
-    <w:p>
-      <w:pPr>
-        <w:spacing w:after="80"/>
-      </w:pPr>
-      <w:r>
-        <w:rPr>
-          <w:rFonts w:ascii="Calibri" w:hAnsi="Calibri"/>
-          <w:i w:val="0"/>
-          <w:sz w:val="22"/>
-        </w:rPr>
-        <w:t>Como x ∈ X \setminus U_N_barra possui ao menos uma cláusula ativa, temos g_c(x) &gt; 0 para c ∈ act(x). Portanto:</w:t>
-      </w:r>
-    </w:p>
-    <w:p>
-      <w:pPr>
-        <w:spacing w:before="80" w:after="120"/>
-        <w:ind w:left="720"/>
-      </w:pPr>
-      <w:r>
-        <w:rPr>
-          <w:rFonts w:ascii="Calibri" w:hAnsi="Calibri"/>
-          <w:b/>
-          <w:color w:val="143264"/>
-          <w:sz w:val="22"/>
-        </w:rPr>
-        <w:t>2 g_c(x)^2 + g_c(x) &gt; 0 ⟹ ⟨ -∇ Φ_quad(x), x ⟩ &lt; -∑_{c ∈ act(x)} g_c(x) &lt; 0</w:t>
-      </w:r>
-    </w:p>
-    <w:p>
-      <w:pPr>
-        <w:spacing w:after="80"/>
-      </w:pPr>
-      <w:r>
-        <w:rPr>
-          <w:rFonts w:ascii="Calibri" w:hAnsi="Calibri"/>
-          <w:i w:val="0"/>
-          <w:sz w:val="22"/>
-        </w:rPr>
-        <w:t>Calculando a derivada temporal da distância à origem ao longo do fluxo \dot{x} = -∇ Φ_quad(x):</w:t>
-      </w:r>
-    </w:p>
-    <w:p>
-      <w:pPr>
-        <w:spacing w:before="80" w:after="120"/>
-        <w:ind w:left="720"/>
-      </w:pPr>
-      <w:r>
-        <w:rPr>
-          <w:rFonts w:ascii="Calibri" w:hAnsi="Calibri"/>
-          <w:b/>
-          <w:color w:val="143264"/>
-          <w:sz w:val="22"/>
-        </w:rPr>
-        <w:t>d/dt \|x(t)\|_2^2 = 2 ⟨ x(t), \dot{x}(t) ⟩ = 2 ⟨ x(t), -∇ Φ_quad(x(t)) ⟩ = -2 ∑_{c ∈ act(x(t))} [2 g_c(x(t))^2 + g_c(x(t))] &lt; 0</w:t>
-      </w:r>
-    </w:p>
-    <w:p>
-      <w:pPr>
-        <w:spacing w:after="80"/>
-      </w:pPr>
-      <w:r>
-        <w:rPr>
-          <w:rFonts w:ascii="Calibri" w:hAnsi="Calibri"/>
-          <w:i w:val="0"/>
-          <w:sz w:val="22"/>
-        </w:rPr>
-        <w:t>A distância à origem decresce monotonicamente ao longo de toda e qualquer trajetória enquanto houver cláusulas ativas. As trajetórias são inexoravelmente comprimidas em direção a U_N. Para fórmulas UNSAT, onde nenhum mínimo de energia zero existe na fronteira, o único conjunto invariante limite é o platô central U_N, provando que 100% do volume do espaço de busca é capturado pela bacia espúria: M_spur(Φ_quad) ≡ 1. ■</w:t>
-      </w:r>
-    </w:p>
-    <w:p>
-      <w:pPr>
-        <w:pStyle w:val="Heading3"/>
-      </w:pPr>
-      <w:r>
-        <w:rPr>
-          <w:rFonts w:ascii="Calibri" w:hAnsi="Calibri"/>
-          <w:b/>
-          <w:color w:val="282828"/>
-          <w:sz w:val="24"/>
-        </w:rPr>
-        <w:t>A Conjectura Central do Programa CLG-R</w:t>
-      </w:r>
-    </w:p>
-    <w:p>
-      <w:pPr>
-        <w:spacing w:after="80"/>
-      </w:pPr>
-      <w:r>
-        <w:rPr>
-          <w:rFonts w:ascii="Calibri" w:hAnsi="Calibri"/>
-          <w:i w:val="0"/>
-          <w:sz w:val="22"/>
-        </w:rPr>
-        <w:t xml:space="preserve">Conforme preconizado por Vossa Senhoria no Parecer nº 11, o comportamento dinâmico de separação assintótica em instâncias aleatórias de 3-SAT é catalogado com total integridade como a </w:t>
-      </w:r>
-      <w:r>
-        <w:rPr>
-          <w:rFonts w:ascii="Calibri" w:hAnsi="Calibri"/>
-          <w:b/>
-          <w:i w:val="0"/>
-          <w:sz w:val="22"/>
-        </w:rPr>
-        <w:t>Conjectura Central do Programa CLG-R</w:t>
-      </w:r>
-      <w:r>
-        <w:rPr>
-          <w:rFonts w:ascii="Calibri" w:hAnsi="Calibri"/>
-          <w:i w:val="0"/>
-          <w:sz w:val="22"/>
-        </w:rPr>
-        <w:t>:</w:t>
-      </w:r>
-    </w:p>
-    <w:p>
-      <w:pPr>
-        <w:spacing w:before="60" w:after="60"/>
-        <w:ind w:left="576"/>
-      </w:pPr>
-      <w:r>
-        <w:rPr>
-          <w:rFonts w:ascii="Calibri" w:hAnsi="Calibri"/>
-          <w:b/>
-          <w:i/>
-          <w:color w:val="323232"/>
-          <w:sz w:val="22"/>
-        </w:rPr>
-        <w:t>Conjectura Central (Separação Dinâmica Assintótica em Ensembles Aleatórios):</w:t>
-      </w:r>
-    </w:p>
-    <w:p>
-      <w:pPr>
-        <w:spacing w:before="60" w:after="60"/>
-        <w:ind w:left="576"/>
-      </w:pPr>
-      <w:r>
-        <w:rPr>
-          <w:rFonts w:ascii="Calibri" w:hAnsi="Calibri"/>
-          <w:i/>
-          <w:color w:val="323232"/>
-          <w:sz w:val="22"/>
-        </w:rPr>
-        <w:t>Considere o ensemble aleatório padrão de 3-SAT E(N, α) com densidade de cláusulas α = M/N acima do limiar de clustering e congelamento dinâmico (α &gt; α_d ≈ 3.86).</w:t>
-      </w:r>
-    </w:p>
-    <w:p>
-      <w:pPr>
-        <w:spacing w:before="60" w:after="60"/>
-        <w:ind w:left="576"/>
-      </w:pPr>
-      <w:r>
-        <w:rPr>
-          <w:rFonts w:ascii="Calibri" w:hAnsi="Calibri"/>
-          <w:i/>
-          <w:color w:val="323232"/>
-          <w:sz w:val="22"/>
-        </w:rPr>
-        <w:t>Existe uma constante universal c(α) &gt; 0 tal que:</w:t>
-      </w:r>
-    </w:p>
-    <w:p>
-      <w:pPr>
-        <w:spacing w:before="60" w:after="60"/>
-        <w:ind w:left="576"/>
-      </w:pPr>
-      <w:r>
-        <w:rPr>
-          <w:rFonts w:ascii="Calibri" w:hAnsi="Calibri"/>
-          <w:i/>
-          <w:color w:val="323232"/>
-          <w:sz w:val="22"/>
-        </w:rPr>
-        <w:t>$lim inf_{N → ∈ fty} [𝔼_{F ~ E(N, α)}[M_spur(Φ_quad)] - 𝔼_{F ~ E(N, α)}[M_spur(Φ_mult)]] ≥ c(α) &gt; 0$</w:t>
-      </w:r>
-    </w:p>
-    <w:p>
-      <w:pPr>
-        <w:spacing w:after="80"/>
-      </w:pPr>
-      <w:r>
-        <w:rPr>
-          <w:rFonts w:ascii="Calibri" w:hAnsi="Calibri"/>
-          <w:b/>
-          <w:i w:val="0"/>
-          <w:sz w:val="22"/>
-        </w:rPr>
-        <w:t>Roadmap Analítico em 3 Etapas para a Resolução da Conjectura:</w:t>
-      </w:r>
-    </w:p>
-    <w:p>
-      <w:pPr>
-        <w:ind w:left="360"/>
-      </w:pPr>
-      <w:r>
-        <w:rPr>
-          <w:rFonts w:ascii="Calibri" w:hAnsi="Calibri"/>
-          <w:b/>
-          <w:sz w:val="22"/>
-        </w:rPr>
-        <w:t xml:space="preserve">1. </w:t>
-      </w:r>
-      <w:r>
-        <w:rPr>
-          <w:rFonts w:ascii="Calibri" w:hAnsi="Calibri"/>
-          <w:b/>
-          <w:i w:val="0"/>
-          <w:sz w:val="22"/>
-        </w:rPr>
-        <w:t>Etapa 1 (Limite Termodinâmico e Campo Médio):</w:t>
-      </w:r>
-      <w:r>
-        <w:rPr>
-          <w:rFonts w:ascii="Calibri" w:hAnsi="Calibri"/>
-          <w:i w:val="0"/>
-          <w:sz w:val="22"/>
-        </w:rPr>
-        <w:t xml:space="preserve"> Formalizar a convergência fraca do campo empírico de forças -∇ Φ_quad para o campo linear contrátil -κ(α) x via equações de McKean-Vlasov.</w:t>
-      </w:r>
-    </w:p>
-    <w:p>
-      <w:pPr>
-        <w:ind w:left="360"/>
-      </w:pPr>
-      <w:r>
-        <w:rPr>
-          <w:rFonts w:ascii="Calibri" w:hAnsi="Calibri"/>
-          <w:b/>
-          <w:sz w:val="22"/>
-        </w:rPr>
-        <w:t xml:space="preserve">2. </w:t>
-      </w:r>
-      <w:r>
-        <w:rPr>
-          <w:rFonts w:ascii="Calibri" w:hAnsi="Calibri"/>
-          <w:b/>
-          <w:i w:val="0"/>
-          <w:sz w:val="22"/>
-        </w:rPr>
-        <w:t>Etapa 2 (Concentração de Medida de Trajetórias):</w:t>
-      </w:r>
-      <w:r>
-        <w:rPr>
-          <w:rFonts w:ascii="Calibri" w:hAnsi="Calibri"/>
-          <w:i w:val="0"/>
-          <w:sz w:val="22"/>
-        </w:rPr>
-        <w:t xml:space="preserve"> Aplicar a desigualdade de martingales de Azuma-Hoeffding para provar que flutuações estocásticas individuais \|x(t) - \bar{x}(t)\|_2 são limitadas por O(√(N log N)) com probabilidade 1 - exp(-Ω(N)).</w:t>
-      </w:r>
-    </w:p>
-    <w:p>
-      <w:pPr>
-        <w:ind w:left="360"/>
-      </w:pPr>
-      <w:r>
-        <w:rPr>
-          <w:rFonts w:ascii="Calibri" w:hAnsi="Calibri"/>
-          <w:b/>
-          <w:sz w:val="22"/>
-        </w:rPr>
-        <w:t xml:space="preserve">3. </w:t>
-      </w:r>
-      <w:r>
-        <w:rPr>
-          <w:rFonts w:ascii="Calibri" w:hAnsi="Calibri"/>
-          <w:b/>
-          <w:i w:val="0"/>
-          <w:sz w:val="22"/>
-        </w:rPr>
-        <w:t>Etapa 3 (Metaestabilidade de Kramers na Paisagem Multilinear):</w:t>
-      </w:r>
-      <w:r>
-        <w:rPr>
-          <w:rFonts w:ascii="Calibri" w:hAnsi="Calibri"/>
-          <w:i w:val="0"/>
-          <w:sz w:val="22"/>
-        </w:rPr>
-        <w:t xml:space="preserve"> Quantificar os tempos de escape de selas de Morse na paisagem multilinear via fórmula de Eyring-Kramers para fluxos gradientes projetados.</w:t>
-      </w:r>
-    </w:p>
-    <w:p>
-      <w:pPr>
-        <w:pStyle w:val="Heading2"/>
-      </w:pPr>
-      <w:r>
-        <w:rPr>
-          <w:rFonts w:ascii="Calibri" w:hAnsi="Calibri"/>
-          <w:b/>
-          <w:color w:val="1B488C"/>
-          <w:sz w:val="28"/>
-        </w:rPr>
-        <w:t>8. Tabela Comparativa de Evolução: Versão 2.0 vs. Versão 3.0</w:t>
+        <w:t>9. Tabela Comparativa de Evolução: Versão 2.0 vs. Versão 3.0</w:t>
       </w:r>
     </w:p>
     <w:tbl>
@@ -4533,7 +4821,7 @@
           <w:color w:val="1B488C"/>
           <w:sz w:val="28"/>
         </w:rPr>
-        <w:t>9. Links Diretos no Repositório Oficial</w:t>
+        <w:t>10. Links Diretos no Repositório Oficial</w:t>
       </w:r>
     </w:p>
     <w:p>

</xml_diff>